<commit_message>
Draft_128: page numbers upper right (companion); not centered
</commit_message>
<xml_diff>
--- a/thesis/003_ThesisProposal_Draft_128_body.docx
+++ b/thesis/003_ThesisProposal_Draft_128_body.docx
@@ -38647,24 +38647,27 @@
 <w:hdr xmlns:mc="http://schemas.openxmlformats.org/markup-compatibility/2006" xmlns:o="urn:schemas-microsoft-com:office:office" xmlns:r="http://schemas.openxmlformats.org/officeDocument/2006/relationships" xmlns:m="http://schemas.openxmlformats.org/officeDocument/2006/math" xmlns:v="urn:schemas-microsoft-com:vml" xmlns:wp="http://schemas.openxmlformats.org/drawingml/2006/wordprocessingDrawing" xmlns:w10="urn:schemas-microsoft-com:office:word" xmlns:w="http://schemas.openxmlformats.org/wordprocessingml/2006/main" xmlns:wne="http://schemas.microsoft.com/office/word/2006/wordml" xmlns:sl="http://schemas.openxmlformats.org/schemaLibrary/2006/main" xmlns:a="http://schemas.openxmlformats.org/drawingml/2006/main" xmlns:pic="http://schemas.openxmlformats.org/drawingml/2006/picture" xmlns:c="http://schemas.openxmlformats.org/drawingml/2006/chart" xmlns:lc="http://schemas.openxmlformats.org/drawingml/2006/lockedCanvas" xmlns:dgm="http://schemas.openxmlformats.org/drawingml/2006/diagram" xmlns:wps="http://schemas.microsoft.com/office/word/2010/wordprocessingShape" xmlns:wpg="http://schemas.microsoft.com/office/word/2010/wordprocessingGroup" xmlns:w14="http://schemas.microsoft.com/office/word/2010/wordml" xmlns:w15="http://schemas.microsoft.com/office/word/2012/wordml" xmlns:w16="http://schemas.microsoft.com/office/word/2018/wordml" xmlns:w16cex="http://schemas.microsoft.com/office/word/2018/wordml/cex" xmlns:w16cid="http://schemas.microsoft.com/office/word/2016/wordml/cid" xmlns="http://schemas.microsoft.com/office/tasks/2019/documenttasks" xmlns:cr="http://schemas.microsoft.com/office/comments/2020/reactions">
   <w:p>
     <w:pPr>
-      <w:jc w:val="center"/>
+      <w:jc w:val="right"/>
       <w:rPr/>
     </w:pPr>
     <w:r>
       <w:rPr>
         <w:rFonts w:ascii="Georgia" w:hAnsi="Georgia" w:eastAsia="Georgia"/>
+        <w:sz w:val="22"/>
       </w:rPr>
       <w:fldChar w:fldCharType="begin"/>
     </w:r>
     <w:r>
       <w:rPr>
         <w:rFonts w:ascii="Georgia" w:hAnsi="Georgia" w:eastAsia="Georgia"/>
+        <w:sz w:val="22"/>
       </w:rPr>
       <w:instrText xml:space="preserve"> PAGE </w:instrText>
     </w:r>
     <w:r>
       <w:rPr>
         <w:rFonts w:ascii="Georgia" w:hAnsi="Georgia" w:eastAsia="Georgia"/>
+        <w:sz w:val="22"/>
       </w:rPr>
       <w:fldChar w:fldCharType="end"/>
     </w:r>
@@ -38687,23 +38690,26 @@
   <w:p>
     <w:pPr>
       <w:pStyle w:val="Header"/>
-      <w:jc w:val="center"/>
+      <w:jc w:val="right"/>
     </w:pPr>
     <w:r>
       <w:rPr>
         <w:rFonts w:ascii="Georgia" w:hAnsi="Georgia" w:eastAsia="Georgia"/>
+        <w:sz w:val="22"/>
       </w:rPr>
       <w:fldChar w:fldCharType="begin"/>
     </w:r>
     <w:r>
       <w:rPr>
         <w:rFonts w:ascii="Georgia" w:hAnsi="Georgia" w:eastAsia="Georgia"/>
+        <w:sz w:val="22"/>
       </w:rPr>
       <w:instrText xml:space="preserve"> PAGE </w:instrText>
     </w:r>
     <w:r>
       <w:rPr>
         <w:rFonts w:ascii="Georgia" w:hAnsi="Georgia" w:eastAsia="Georgia"/>
+        <w:sz w:val="22"/>
       </w:rPr>
       <w:fldChar w:fldCharType="end"/>
     </w:r>
@@ -38726,23 +38732,26 @@
   <w:p>
     <w:pPr>
       <w:pStyle w:val="Header"/>
-      <w:jc w:val="center"/>
+      <w:jc w:val="right"/>
     </w:pPr>
     <w:r>
       <w:rPr>
         <w:rFonts w:ascii="Georgia" w:hAnsi="Georgia" w:eastAsia="Georgia"/>
+        <w:sz w:val="22"/>
       </w:rPr>
       <w:fldChar w:fldCharType="begin"/>
     </w:r>
     <w:r>
       <w:rPr>
         <w:rFonts w:ascii="Georgia" w:hAnsi="Georgia" w:eastAsia="Georgia"/>
+        <w:sz w:val="22"/>
       </w:rPr>
       <w:instrText xml:space="preserve"> PAGE </w:instrText>
     </w:r>
     <w:r>
       <w:rPr>
         <w:rFonts w:ascii="Georgia" w:hAnsi="Georgia" w:eastAsia="Georgia"/>
+        <w:sz w:val="22"/>
       </w:rPr>
       <w:fldChar w:fldCharType="end"/>
     </w:r>
@@ -38765,23 +38774,26 @@
   <w:p>
     <w:pPr>
       <w:pStyle w:val="Header"/>
-      <w:jc w:val="center"/>
+      <w:jc w:val="right"/>
     </w:pPr>
     <w:r>
       <w:rPr>
         <w:rFonts w:ascii="Georgia" w:hAnsi="Georgia" w:eastAsia="Georgia"/>
+        <w:sz w:val="22"/>
       </w:rPr>
       <w:fldChar w:fldCharType="begin"/>
     </w:r>
     <w:r>
       <w:rPr>
         <w:rFonts w:ascii="Georgia" w:hAnsi="Georgia" w:eastAsia="Georgia"/>
+        <w:sz w:val="22"/>
       </w:rPr>
       <w:instrText xml:space="preserve"> PAGE </w:instrText>
     </w:r>
     <w:r>
       <w:rPr>
         <w:rFonts w:ascii="Georgia" w:hAnsi="Georgia" w:eastAsia="Georgia"/>
+        <w:sz w:val="22"/>
       </w:rPr>
       <w:fldChar w:fldCharType="end"/>
     </w:r>
@@ -38804,23 +38816,26 @@
   <w:p>
     <w:pPr>
       <w:pStyle w:val="Header"/>
-      <w:jc w:val="center"/>
+      <w:jc w:val="right"/>
     </w:pPr>
     <w:r>
       <w:rPr>
         <w:rFonts w:ascii="Georgia" w:hAnsi="Georgia" w:eastAsia="Georgia"/>
+        <w:sz w:val="22"/>
       </w:rPr>
       <w:fldChar w:fldCharType="begin"/>
     </w:r>
     <w:r>
       <w:rPr>
         <w:rFonts w:ascii="Georgia" w:hAnsi="Georgia" w:eastAsia="Georgia"/>
+        <w:sz w:val="22"/>
       </w:rPr>
       <w:instrText xml:space="preserve"> PAGE </w:instrText>
     </w:r>
     <w:r>
       <w:rPr>
         <w:rFonts w:ascii="Georgia" w:hAnsi="Georgia" w:eastAsia="Georgia"/>
+        <w:sz w:val="22"/>
       </w:rPr>
       <w:fldChar w:fldCharType="end"/>
     </w:r>
@@ -38853,23 +38868,26 @@
   <w:p>
     <w:pPr>
       <w:pStyle w:val="Header"/>
-      <w:jc w:val="center"/>
+      <w:jc w:val="right"/>
     </w:pPr>
     <w:r>
       <w:rPr>
         <w:rFonts w:ascii="Georgia" w:hAnsi="Georgia" w:eastAsia="Georgia"/>
+        <w:sz w:val="22"/>
       </w:rPr>
       <w:fldChar w:fldCharType="begin"/>
     </w:r>
     <w:r>
       <w:rPr>
         <w:rFonts w:ascii="Georgia" w:hAnsi="Georgia" w:eastAsia="Georgia"/>
+        <w:sz w:val="22"/>
       </w:rPr>
       <w:instrText xml:space="preserve"> PAGE </w:instrText>
     </w:r>
     <w:r>
       <w:rPr>
         <w:rFonts w:ascii="Georgia" w:hAnsi="Georgia" w:eastAsia="Georgia"/>
+        <w:sz w:val="22"/>
       </w:rPr>
       <w:fldChar w:fldCharType="end"/>
     </w:r>
@@ -38892,23 +38910,26 @@
   <w:p>
     <w:pPr>
       <w:pStyle w:val="Header"/>
-      <w:jc w:val="center"/>
+      <w:jc w:val="right"/>
     </w:pPr>
     <w:r>
       <w:rPr>
         <w:rFonts w:ascii="Georgia" w:hAnsi="Georgia" w:eastAsia="Georgia"/>
+        <w:sz w:val="22"/>
       </w:rPr>
       <w:fldChar w:fldCharType="begin"/>
     </w:r>
     <w:r>
       <w:rPr>
         <w:rFonts w:ascii="Georgia" w:hAnsi="Georgia" w:eastAsia="Georgia"/>
+        <w:sz w:val="22"/>
       </w:rPr>
       <w:instrText xml:space="preserve"> PAGE </w:instrText>
     </w:r>
     <w:r>
       <w:rPr>
         <w:rFonts w:ascii="Georgia" w:hAnsi="Georgia" w:eastAsia="Georgia"/>
+        <w:sz w:val="22"/>
       </w:rPr>
       <w:fldChar w:fldCharType="end"/>
     </w:r>
@@ -38931,23 +38952,26 @@
   <w:p>
     <w:pPr>
       <w:pStyle w:val="Header"/>
-      <w:jc w:val="center"/>
+      <w:jc w:val="right"/>
     </w:pPr>
     <w:r>
       <w:rPr>
         <w:rFonts w:ascii="Georgia" w:hAnsi="Georgia" w:eastAsia="Georgia"/>
+        <w:sz w:val="22"/>
       </w:rPr>
       <w:fldChar w:fldCharType="begin"/>
     </w:r>
     <w:r>
       <w:rPr>
         <w:rFonts w:ascii="Georgia" w:hAnsi="Georgia" w:eastAsia="Georgia"/>
+        <w:sz w:val="22"/>
       </w:rPr>
       <w:instrText xml:space="preserve"> PAGE </w:instrText>
     </w:r>
     <w:r>
       <w:rPr>
         <w:rFonts w:ascii="Georgia" w:hAnsi="Georgia" w:eastAsia="Georgia"/>
+        <w:sz w:val="22"/>
       </w:rPr>
       <w:fldChar w:fldCharType="end"/>
     </w:r>
@@ -38970,23 +38994,26 @@
   <w:p>
     <w:pPr>
       <w:pStyle w:val="Header"/>
-      <w:jc w:val="center"/>
+      <w:jc w:val="right"/>
     </w:pPr>
     <w:r>
       <w:rPr>
         <w:rFonts w:ascii="Georgia" w:hAnsi="Georgia" w:eastAsia="Georgia"/>
+        <w:sz w:val="22"/>
       </w:rPr>
       <w:fldChar w:fldCharType="begin"/>
     </w:r>
     <w:r>
       <w:rPr>
         <w:rFonts w:ascii="Georgia" w:hAnsi="Georgia" w:eastAsia="Georgia"/>
+        <w:sz w:val="22"/>
       </w:rPr>
       <w:instrText xml:space="preserve"> PAGE </w:instrText>
     </w:r>
     <w:r>
       <w:rPr>
         <w:rFonts w:ascii="Georgia" w:hAnsi="Georgia" w:eastAsia="Georgia"/>
+        <w:sz w:val="22"/>
       </w:rPr>
       <w:fldChar w:fldCharType="end"/>
     </w:r>

</xml_diff>

<commit_message>
Draft_128: force page numbers upper-right via right tab + jc (Header style override)
</commit_message>
<xml_diff>
--- a/thesis/003_ThesisProposal_Draft_128_body.docx
+++ b/thesis/003_ThesisProposal_Draft_128_body.docx
@@ -38647,9 +38647,19 @@
 <w:hdr xmlns:mc="http://schemas.openxmlformats.org/markup-compatibility/2006" xmlns:o="urn:schemas-microsoft-com:office:office" xmlns:r="http://schemas.openxmlformats.org/officeDocument/2006/relationships" xmlns:m="http://schemas.openxmlformats.org/officeDocument/2006/math" xmlns:v="urn:schemas-microsoft-com:vml" xmlns:wp="http://schemas.openxmlformats.org/drawingml/2006/wordprocessingDrawing" xmlns:w10="urn:schemas-microsoft-com:office:word" xmlns:w="http://schemas.openxmlformats.org/wordprocessingml/2006/main" xmlns:wne="http://schemas.microsoft.com/office/word/2006/wordml" xmlns:sl="http://schemas.openxmlformats.org/schemaLibrary/2006/main" xmlns:a="http://schemas.openxmlformats.org/drawingml/2006/main" xmlns:pic="http://schemas.openxmlformats.org/drawingml/2006/picture" xmlns:c="http://schemas.openxmlformats.org/drawingml/2006/chart" xmlns:lc="http://schemas.openxmlformats.org/drawingml/2006/lockedCanvas" xmlns:dgm="http://schemas.openxmlformats.org/drawingml/2006/diagram" xmlns:wps="http://schemas.microsoft.com/office/word/2010/wordprocessingShape" xmlns:wpg="http://schemas.microsoft.com/office/word/2010/wordprocessingGroup" xmlns:w14="http://schemas.microsoft.com/office/word/2010/wordml" xmlns:w15="http://schemas.microsoft.com/office/word/2012/wordml" xmlns:w16="http://schemas.microsoft.com/office/word/2018/wordml" xmlns:w16cex="http://schemas.microsoft.com/office/word/2018/wordml/cex" xmlns:w16cid="http://schemas.microsoft.com/office/word/2016/wordml/cid" xmlns="http://schemas.microsoft.com/office/tasks/2019/documenttasks" xmlns:cr="http://schemas.microsoft.com/office/comments/2020/reactions">
   <w:p>
     <w:pPr>
+      <w:rPr/>
+      <w:tabs>
+        <w:tab w:val="right" w:pos="8306"/>
+      </w:tabs>
       <w:jc w:val="right"/>
-      <w:rPr/>
     </w:pPr>
+    <w:r>
+      <w:rPr>
+        <w:rFonts w:ascii="Georgia" w:hAnsi="Georgia"/>
+        <w:sz w:val="22"/>
+      </w:rPr>
+      <w:tab/>
+    </w:r>
     <w:r>
       <w:rPr>
         <w:rFonts w:ascii="Georgia" w:hAnsi="Georgia" w:eastAsia="Georgia"/>
@@ -38689,9 +38699,18 @@
 <w:hdr xmlns:m="http://schemas.openxmlformats.org/officeDocument/2006/math" xmlns:mc="http://schemas.openxmlformats.org/markup-compatibility/2006" xmlns:mo="http://schemas.microsoft.com/office/mac/office/2008/main" xmlns:mv="urn:schemas-microsoft-com:mac:vml" xmlns:o="urn:schemas-microsoft-com:office:office" xmlns:r="http://schemas.openxmlformats.org/officeDocument/2006/relationships" xmlns:v="urn:schemas-microsoft-com:vml" xmlns:w10="urn:schemas-microsoft-com:office:word" xmlns:w14="http://schemas.microsoft.com/office/word/2010/wordml" xmlns:w="http://schemas.openxmlformats.org/wordprocessingml/2006/main" xmlns:wne="http://schemas.microsoft.com/office/word/2006/wordml" xmlns:wp14="http://schemas.microsoft.com/office/word/2010/wordprocessingDrawing" xmlns:wp="http://schemas.openxmlformats.org/drawingml/2006/wordprocessingDrawing" xmlns:wpc="http://schemas.microsoft.com/office/word/2010/wordprocessingCanvas" xmlns:wpg="http://schemas.microsoft.com/office/word/2010/wordprocessingGroup" xmlns:wpi="http://schemas.microsoft.com/office/word/2010/wordprocessingInk" xmlns:wps="http://schemas.microsoft.com/office/word/2010/wordprocessingShape" mc:Ignorable="w14 wp14">
   <w:p>
     <w:pPr>
-      <w:pStyle w:val="Header"/>
+      <w:tabs>
+        <w:tab w:val="right" w:pos="8306"/>
+      </w:tabs>
       <w:jc w:val="right"/>
     </w:pPr>
+    <w:r>
+      <w:rPr>
+        <w:rFonts w:ascii="Georgia" w:hAnsi="Georgia"/>
+        <w:sz w:val="22"/>
+      </w:rPr>
+      <w:tab/>
+    </w:r>
     <w:r>
       <w:rPr>
         <w:rFonts w:ascii="Georgia" w:hAnsi="Georgia" w:eastAsia="Georgia"/>
@@ -38731,9 +38750,18 @@
 <w:hdr xmlns:m="http://schemas.openxmlformats.org/officeDocument/2006/math" xmlns:mc="http://schemas.openxmlformats.org/markup-compatibility/2006" xmlns:mo="http://schemas.microsoft.com/office/mac/office/2008/main" xmlns:mv="urn:schemas-microsoft-com:mac:vml" xmlns:o="urn:schemas-microsoft-com:office:office" xmlns:r="http://schemas.openxmlformats.org/officeDocument/2006/relationships" xmlns:v="urn:schemas-microsoft-com:vml" xmlns:w10="urn:schemas-microsoft-com:office:word" xmlns:w14="http://schemas.microsoft.com/office/word/2010/wordml" xmlns:w="http://schemas.openxmlformats.org/wordprocessingml/2006/main" xmlns:wne="http://schemas.microsoft.com/office/word/2006/wordml" xmlns:wp14="http://schemas.microsoft.com/office/word/2010/wordprocessingDrawing" xmlns:wp="http://schemas.openxmlformats.org/drawingml/2006/wordprocessingDrawing" xmlns:wpc="http://schemas.microsoft.com/office/word/2010/wordprocessingCanvas" xmlns:wpg="http://schemas.microsoft.com/office/word/2010/wordprocessingGroup" xmlns:wpi="http://schemas.microsoft.com/office/word/2010/wordprocessingInk" xmlns:wps="http://schemas.microsoft.com/office/word/2010/wordprocessingShape" mc:Ignorable="w14 wp14">
   <w:p>
     <w:pPr>
-      <w:pStyle w:val="Header"/>
+      <w:tabs>
+        <w:tab w:val="right" w:pos="8306"/>
+      </w:tabs>
       <w:jc w:val="right"/>
     </w:pPr>
+    <w:r>
+      <w:rPr>
+        <w:rFonts w:ascii="Georgia" w:hAnsi="Georgia"/>
+        <w:sz w:val="22"/>
+      </w:rPr>
+      <w:tab/>
+    </w:r>
     <w:r>
       <w:rPr>
         <w:rFonts w:ascii="Georgia" w:hAnsi="Georgia" w:eastAsia="Georgia"/>
@@ -38773,9 +38801,18 @@
 <w:hdr xmlns:m="http://schemas.openxmlformats.org/officeDocument/2006/math" xmlns:mc="http://schemas.openxmlformats.org/markup-compatibility/2006" xmlns:mo="http://schemas.microsoft.com/office/mac/office/2008/main" xmlns:mv="urn:schemas-microsoft-com:mac:vml" xmlns:o="urn:schemas-microsoft-com:office:office" xmlns:r="http://schemas.openxmlformats.org/officeDocument/2006/relationships" xmlns:v="urn:schemas-microsoft-com:vml" xmlns:w10="urn:schemas-microsoft-com:office:word" xmlns:w14="http://schemas.microsoft.com/office/word/2010/wordml" xmlns:w="http://schemas.openxmlformats.org/wordprocessingml/2006/main" xmlns:wne="http://schemas.microsoft.com/office/word/2006/wordml" xmlns:wp14="http://schemas.microsoft.com/office/word/2010/wordprocessingDrawing" xmlns:wp="http://schemas.openxmlformats.org/drawingml/2006/wordprocessingDrawing" xmlns:wpc="http://schemas.microsoft.com/office/word/2010/wordprocessingCanvas" xmlns:wpg="http://schemas.microsoft.com/office/word/2010/wordprocessingGroup" xmlns:wpi="http://schemas.microsoft.com/office/word/2010/wordprocessingInk" xmlns:wps="http://schemas.microsoft.com/office/word/2010/wordprocessingShape" mc:Ignorable="w14 wp14">
   <w:p>
     <w:pPr>
-      <w:pStyle w:val="Header"/>
+      <w:tabs>
+        <w:tab w:val="right" w:pos="8306"/>
+      </w:tabs>
       <w:jc w:val="right"/>
     </w:pPr>
+    <w:r>
+      <w:rPr>
+        <w:rFonts w:ascii="Georgia" w:hAnsi="Georgia"/>
+        <w:sz w:val="22"/>
+      </w:rPr>
+      <w:tab/>
+    </w:r>
     <w:r>
       <w:rPr>
         <w:rFonts w:ascii="Georgia" w:hAnsi="Georgia" w:eastAsia="Georgia"/>
@@ -38815,9 +38852,18 @@
 <w:hdr xmlns:m="http://schemas.openxmlformats.org/officeDocument/2006/math" xmlns:mc="http://schemas.openxmlformats.org/markup-compatibility/2006" xmlns:mo="http://schemas.microsoft.com/office/mac/office/2008/main" xmlns:mv="urn:schemas-microsoft-com:mac:vml" xmlns:o="urn:schemas-microsoft-com:office:office" xmlns:r="http://schemas.openxmlformats.org/officeDocument/2006/relationships" xmlns:v="urn:schemas-microsoft-com:vml" xmlns:w10="urn:schemas-microsoft-com:office:word" xmlns:w14="http://schemas.microsoft.com/office/word/2010/wordml" xmlns:w="http://schemas.openxmlformats.org/wordprocessingml/2006/main" xmlns:wne="http://schemas.microsoft.com/office/word/2006/wordml" xmlns:wp14="http://schemas.microsoft.com/office/word/2010/wordprocessingDrawing" xmlns:wp="http://schemas.openxmlformats.org/drawingml/2006/wordprocessingDrawing" xmlns:wpc="http://schemas.microsoft.com/office/word/2010/wordprocessingCanvas" xmlns:wpg="http://schemas.microsoft.com/office/word/2010/wordprocessingGroup" xmlns:wpi="http://schemas.microsoft.com/office/word/2010/wordprocessingInk" xmlns:wps="http://schemas.microsoft.com/office/word/2010/wordprocessingShape" mc:Ignorable="w14 wp14">
   <w:p>
     <w:pPr>
-      <w:pStyle w:val="Header"/>
+      <w:tabs>
+        <w:tab w:val="right" w:pos="8306"/>
+      </w:tabs>
       <w:jc w:val="right"/>
     </w:pPr>
+    <w:r>
+      <w:rPr>
+        <w:rFonts w:ascii="Georgia" w:hAnsi="Georgia"/>
+        <w:sz w:val="22"/>
+      </w:rPr>
+      <w:tab/>
+    </w:r>
     <w:r>
       <w:rPr>
         <w:rFonts w:ascii="Georgia" w:hAnsi="Georgia" w:eastAsia="Georgia"/>
@@ -38867,9 +38913,18 @@
 <w:hdr xmlns:m="http://schemas.openxmlformats.org/officeDocument/2006/math" xmlns:mc="http://schemas.openxmlformats.org/markup-compatibility/2006" xmlns:mo="http://schemas.microsoft.com/office/mac/office/2008/main" xmlns:mv="urn:schemas-microsoft-com:mac:vml" xmlns:o="urn:schemas-microsoft-com:office:office" xmlns:r="http://schemas.openxmlformats.org/officeDocument/2006/relationships" xmlns:v="urn:schemas-microsoft-com:vml" xmlns:w10="urn:schemas-microsoft-com:office:word" xmlns:w14="http://schemas.microsoft.com/office/word/2010/wordml" xmlns:w="http://schemas.openxmlformats.org/wordprocessingml/2006/main" xmlns:wne="http://schemas.microsoft.com/office/word/2006/wordml" xmlns:wp14="http://schemas.microsoft.com/office/word/2010/wordprocessingDrawing" xmlns:wp="http://schemas.openxmlformats.org/drawingml/2006/wordprocessingDrawing" xmlns:wpc="http://schemas.microsoft.com/office/word/2010/wordprocessingCanvas" xmlns:wpg="http://schemas.microsoft.com/office/word/2010/wordprocessingGroup" xmlns:wpi="http://schemas.microsoft.com/office/word/2010/wordprocessingInk" xmlns:wps="http://schemas.microsoft.com/office/word/2010/wordprocessingShape" mc:Ignorable="w14 wp14">
   <w:p>
     <w:pPr>
-      <w:pStyle w:val="Header"/>
+      <w:tabs>
+        <w:tab w:val="right" w:pos="8306"/>
+      </w:tabs>
       <w:jc w:val="right"/>
     </w:pPr>
+    <w:r>
+      <w:rPr>
+        <w:rFonts w:ascii="Georgia" w:hAnsi="Georgia"/>
+        <w:sz w:val="22"/>
+      </w:rPr>
+      <w:tab/>
+    </w:r>
     <w:r>
       <w:rPr>
         <w:rFonts w:ascii="Georgia" w:hAnsi="Georgia" w:eastAsia="Georgia"/>
@@ -38909,9 +38964,18 @@
 <w:hdr xmlns:m="http://schemas.openxmlformats.org/officeDocument/2006/math" xmlns:mc="http://schemas.openxmlformats.org/markup-compatibility/2006" xmlns:mo="http://schemas.microsoft.com/office/mac/office/2008/main" xmlns:mv="urn:schemas-microsoft-com:mac:vml" xmlns:o="urn:schemas-microsoft-com:office:office" xmlns:r="http://schemas.openxmlformats.org/officeDocument/2006/relationships" xmlns:v="urn:schemas-microsoft-com:vml" xmlns:w10="urn:schemas-microsoft-com:office:word" xmlns:w14="http://schemas.microsoft.com/office/word/2010/wordml" xmlns:w="http://schemas.openxmlformats.org/wordprocessingml/2006/main" xmlns:wne="http://schemas.microsoft.com/office/word/2006/wordml" xmlns:wp14="http://schemas.microsoft.com/office/word/2010/wordprocessingDrawing" xmlns:wp="http://schemas.openxmlformats.org/drawingml/2006/wordprocessingDrawing" xmlns:wpc="http://schemas.microsoft.com/office/word/2010/wordprocessingCanvas" xmlns:wpg="http://schemas.microsoft.com/office/word/2010/wordprocessingGroup" xmlns:wpi="http://schemas.microsoft.com/office/word/2010/wordprocessingInk" xmlns:wps="http://schemas.microsoft.com/office/word/2010/wordprocessingShape" mc:Ignorable="w14 wp14">
   <w:p>
     <w:pPr>
-      <w:pStyle w:val="Header"/>
+      <w:tabs>
+        <w:tab w:val="right" w:pos="8306"/>
+      </w:tabs>
       <w:jc w:val="right"/>
     </w:pPr>
+    <w:r>
+      <w:rPr>
+        <w:rFonts w:ascii="Georgia" w:hAnsi="Georgia"/>
+        <w:sz w:val="22"/>
+      </w:rPr>
+      <w:tab/>
+    </w:r>
     <w:r>
       <w:rPr>
         <w:rFonts w:ascii="Georgia" w:hAnsi="Georgia" w:eastAsia="Georgia"/>
@@ -38951,9 +39015,18 @@
 <w:hdr xmlns:m="http://schemas.openxmlformats.org/officeDocument/2006/math" xmlns:mc="http://schemas.openxmlformats.org/markup-compatibility/2006" xmlns:mo="http://schemas.microsoft.com/office/mac/office/2008/main" xmlns:mv="urn:schemas-microsoft-com:mac:vml" xmlns:o="urn:schemas-microsoft-com:office:office" xmlns:r="http://schemas.openxmlformats.org/officeDocument/2006/relationships" xmlns:v="urn:schemas-microsoft-com:vml" xmlns:w10="urn:schemas-microsoft-com:office:word" xmlns:w14="http://schemas.microsoft.com/office/word/2010/wordml" xmlns:w="http://schemas.openxmlformats.org/wordprocessingml/2006/main" xmlns:wne="http://schemas.microsoft.com/office/word/2006/wordml" xmlns:wp14="http://schemas.microsoft.com/office/word/2010/wordprocessingDrawing" xmlns:wp="http://schemas.openxmlformats.org/drawingml/2006/wordprocessingDrawing" xmlns:wpc="http://schemas.microsoft.com/office/word/2010/wordprocessingCanvas" xmlns:wpg="http://schemas.microsoft.com/office/word/2010/wordprocessingGroup" xmlns:wpi="http://schemas.microsoft.com/office/word/2010/wordprocessingInk" xmlns:wps="http://schemas.microsoft.com/office/word/2010/wordprocessingShape" mc:Ignorable="w14 wp14">
   <w:p>
     <w:pPr>
-      <w:pStyle w:val="Header"/>
+      <w:tabs>
+        <w:tab w:val="right" w:pos="8306"/>
+      </w:tabs>
       <w:jc w:val="right"/>
     </w:pPr>
+    <w:r>
+      <w:rPr>
+        <w:rFonts w:ascii="Georgia" w:hAnsi="Georgia"/>
+        <w:sz w:val="22"/>
+      </w:rPr>
+      <w:tab/>
+    </w:r>
     <w:r>
       <w:rPr>
         <w:rFonts w:ascii="Georgia" w:hAnsi="Georgia" w:eastAsia="Georgia"/>
@@ -38993,9 +39066,18 @@
 <w:hdr xmlns:m="http://schemas.openxmlformats.org/officeDocument/2006/math" xmlns:mc="http://schemas.openxmlformats.org/markup-compatibility/2006" xmlns:mo="http://schemas.microsoft.com/office/mac/office/2008/main" xmlns:mv="urn:schemas-microsoft-com:mac:vml" xmlns:o="urn:schemas-microsoft-com:office:office" xmlns:r="http://schemas.openxmlformats.org/officeDocument/2006/relationships" xmlns:v="urn:schemas-microsoft-com:vml" xmlns:w10="urn:schemas-microsoft-com:office:word" xmlns:w14="http://schemas.microsoft.com/office/word/2010/wordml" xmlns:w="http://schemas.openxmlformats.org/wordprocessingml/2006/main" xmlns:wne="http://schemas.microsoft.com/office/word/2006/wordml" xmlns:wp14="http://schemas.microsoft.com/office/word/2010/wordprocessingDrawing" xmlns:wp="http://schemas.openxmlformats.org/drawingml/2006/wordprocessingDrawing" xmlns:wpc="http://schemas.microsoft.com/office/word/2010/wordprocessingCanvas" xmlns:wpg="http://schemas.microsoft.com/office/word/2010/wordprocessingGroup" xmlns:wpi="http://schemas.microsoft.com/office/word/2010/wordprocessingInk" xmlns:wps="http://schemas.microsoft.com/office/word/2010/wordprocessingShape" mc:Ignorable="w14 wp14">
   <w:p>
     <w:pPr>
-      <w:pStyle w:val="Header"/>
+      <w:tabs>
+        <w:tab w:val="right" w:pos="8306"/>
+      </w:tabs>
       <w:jc w:val="right"/>
     </w:pPr>
+    <w:r>
+      <w:rPr>
+        <w:rFonts w:ascii="Georgia" w:hAnsi="Georgia"/>
+        <w:sz w:val="22"/>
+      </w:rPr>
+      <w:tab/>
+    </w:r>
     <w:r>
       <w:rPr>
         <w:rFonts w:ascii="Georgia" w:hAnsi="Georgia" w:eastAsia="Georgia"/>

</xml_diff>

<commit_message>
Draft_128: fix References — add 12 missing APA entries; drop unused Saengsuwan; clean list before Appendix A
</commit_message>
<xml_diff>
--- a/thesis/003_ThesisProposal_Draft_128_body.docx
+++ b/thesis/003_ThesisProposal_Draft_128_body.docx
@@ -20316,56 +20316,55 @@
     <w:p>
       <w:pPr>
         <w:spacing w:after="0" w:before="0" w:line="480" w:lineRule="auto"/>
-        <w:rPr/>
-      </w:pPr>
-      <w:r>
-        <w:rPr>
-          <w:rtl w:val="0"/>
-        </w:rPr>
-      </w:r>
-    </w:p>
-    <w:p>
-      <w:pPr>
-        <w:spacing w:after="0" w:before="0" w:line="480" w:lineRule="auto"/>
-        <w:rPr/>
-      </w:pPr>
-      <w:r>
-        <w:rPr>
-          <w:rtl w:val="0"/>
-        </w:rPr>
-      </w:r>
-    </w:p>
-    <w:p>
-      <w:pPr>
-        <w:spacing w:after="0" w:before="0" w:line="480" w:lineRule="auto"/>
-        <w:rPr/>
-      </w:pPr>
-      <w:r>
-        <w:rPr>
-          <w:rtl w:val="0"/>
-        </w:rPr>
-      </w:r>
-    </w:p>
-    <w:p>
-      <w:pPr>
-        <w:spacing w:after="0" w:before="0" w:line="480" w:lineRule="auto"/>
         <w:ind w:left="720" w:hanging="720"/>
-        <w:jc w:val="both"/>
-        <w:rPr/>
-      </w:pPr>
-      <w:r>
-        <w:rPr>
-          <w:rFonts w:ascii="Georgia" w:cs="Georgia" w:eastAsia="Georgia" w:hAnsi="Georgia"/>
-          <w:b w:val="0"/>
-          <w:bCs w:val="0"/>
-          <w:i w:val="0"/>
-          <w:iCs w:val="0"/>
-          <w:sz w:val="22"/>
-          <w:szCs w:val="22"/>
-          <w:rtl w:val="0"/>
-        </w:rPr>
-        <w:t xml:space="preserve">Afshar, H. S., Moradi, M., &amp; Hamzavi, R. (2014). Frequency and type of hedging devices used in the research articles of humanities, basic sciences and agriculture. Procedia - Social and Behavioral Sciences, 136, 70-74. </w:t>
-      </w:r>
+        <w:jc w:val="left"/>
+        <w:rPr/>
+      </w:pPr>
+      <w:r>
+        <w:rPr>
+          <w:rFonts w:ascii="Georgia" w:hAnsi="Georgia" w:eastAsia="Georgia"/>
+          <w:sz w:val="22"/>
+        </w:rPr>
+        <w:t>Afshar, H. S., Moradi, M., &amp; Hamzavi, R. (2014). Frequency and type of hedging devices used in the research articles of humanities, basic sciences and agriculture. Procedia - Social and Behavioral Sciences, 136, 70-74. https://doi.org/10.1016/j.sbspro.2014.05.290</w:t>
+      </w:r>
+    </w:p>
+    <w:p>
+      <w:pPr>
+        <w:spacing w:after="0" w:before="0" w:line="480" w:lineRule="auto"/>
+        <w:ind w:left="720" w:hanging="720"/>
+        <w:jc w:val="left"/>
+        <w:rPr/>
+      </w:pPr>
+      <w:r>
+        <w:rPr>
+          <w:rFonts w:ascii="Georgia" w:hAnsi="Georgia" w:eastAsia="Georgia"/>
+          <w:sz w:val="22"/>
+        </w:rPr>
+        <w:t>Al-Zarieni, M. M., &amp; Alkhresheh, M. M. (2024). Hedges and boosters in the abstract sections of master thesis at Yarmouk University. International Journal of Linguistics, Literature and Translation, 7(1), 199–207. https://doi.org/10.32996/ijllt.2024.7.1.18</w:t>
+      </w:r>
+    </w:p>
+    <w:p>
+      <w:pPr>
+        <w:spacing w:after="0" w:before="0" w:line="480" w:lineRule="auto"/>
+        <w:ind w:left="720" w:hanging="720"/>
+        <w:jc w:val="left"/>
+        <w:rPr/>
+      </w:pPr>
+      <w:r>
+        <w:rPr>
+          <w:rFonts w:ascii="Georgia" w:hAnsi="Georgia" w:eastAsia="Georgia"/>
+          <w:sz w:val="22"/>
+        </w:rPr>
+        <w:t>Alonso Alonso, R. (2019). A multicompetence perspective of hedging in second language academic writing. Onomázein, 45, 58–78. https://doi.org/10.7764/onomazein.45.02</w:t>
+      </w:r>
+    </w:p>
+    <w:p>
+      <w:pPr>
+        <w:spacing w:after="0" w:before="0" w:line="480" w:lineRule="auto"/>
+        <w:ind w:left="720" w:hanging="720"/>
+        <w:jc w:val="left"/>
+        <w:rPr/>
+      </w:pPr>
       <w:hyperlink r:id="rId11">
         <w:r>
           <w:rPr>
@@ -20379,154 +20378,79 @@
       </w:hyperlink>
       <w:r>
         <w:rPr>
-          <w:rtl w:val="0"/>
-        </w:rPr>
+          <w:rFonts w:ascii="Georgia" w:hAnsi="Georgia" w:eastAsia="Georgia"/>
+          <w:sz w:val="22"/>
+        </w:rPr>
+        <w:t>Bayraktar-Çepni, S., &amp; Kulaksız, E. (2022). A comparative study on the use of hedging devices across ELT MA and PhD theses. Futuristic Implementations of Research in Education (FIRE), 3(1), 58–66.</w:t>
       </w:r>
     </w:p>
     <w:p>
       <w:pPr>
         <w:spacing w:after="0" w:before="0" w:line="480" w:lineRule="auto"/>
         <w:ind w:left="720" w:hanging="720"/>
-        <w:jc w:val="both"/>
-        <w:rPr/>
-      </w:pPr>
-      <w:r>
-        <w:rPr>
-          <w:rFonts w:ascii="Georgia" w:cs="Georgia" w:eastAsia="Georgia" w:hAnsi="Georgia"/>
-          <w:b w:val="0"/>
-          <w:bCs w:val="0"/>
-          <w:i w:val="0"/>
-          <w:iCs w:val="0"/>
-          <w:sz w:val="22"/>
-          <w:szCs w:val="22"/>
-          <w:rtl w:val="0"/>
-        </w:rPr>
-        <w:t xml:space="preserve">Al-Zarieni, M. M., &amp; Alkhresheh, M. M. (2024). Hedges and boosters in the abstract sections of master thesis at Yarmouk University. International Journal of Linguistics, Literature and Translation, 7(1), 199–207. https://doi.org/10.32996/ijllt.2024.7.1.18</w:t>
-      </w:r>
-      <w:r>
-        <w:rPr>
-          <w:rtl w:val="0"/>
-        </w:rPr>
+        <w:jc w:val="left"/>
+        <w:rPr/>
+      </w:pPr>
+      <w:r>
+        <w:rPr>
+          <w:rFonts w:ascii="Georgia" w:hAnsi="Georgia" w:eastAsia="Georgia"/>
+          <w:sz w:val="22"/>
+        </w:rPr>
+        <w:t>Biber, D., Conrad, S., &amp; Reppen, R. (1998). Corpus linguistics: Investigating language structure and use. Cambridge University Press.</w:t>
       </w:r>
     </w:p>
     <w:p>
       <w:pPr>
         <w:spacing w:after="0" w:before="0" w:line="480" w:lineRule="auto"/>
         <w:ind w:left="720" w:hanging="720"/>
-        <w:jc w:val="both"/>
-        <w:rPr/>
-      </w:pPr>
-      <w:r>
-        <w:rPr>
-          <w:rFonts w:ascii="Georgia" w:cs="Georgia" w:eastAsia="Georgia" w:hAnsi="Georgia"/>
-          <w:b w:val="0"/>
-          <w:bCs w:val="0"/>
-          <w:i w:val="0"/>
-          <w:iCs w:val="0"/>
-          <w:sz w:val="22"/>
-          <w:szCs w:val="22"/>
-          <w:rtl w:val="0"/>
-        </w:rPr>
-        <w:t xml:space="preserve">Bayraktar-Çepni, S., &amp; Kulaksız, E. (2022). A comparative study on the use of hedging devices across ELT MA and PhD theses. Futuristic Implementations of Research in Education (FIRE), 3(1), 58–66.</w:t>
-      </w:r>
-      <w:r>
-        <w:rPr>
-          <w:rtl w:val="0"/>
-        </w:rPr>
+        <w:jc w:val="left"/>
+        <w:rPr/>
+      </w:pPr>
+      <w:r>
+        <w:rPr>
+          <w:rFonts w:ascii="Georgia" w:hAnsi="Georgia" w:eastAsia="Georgia"/>
+          <w:sz w:val="22"/>
+        </w:rPr>
+        <w:t>Bonyadi, A., Gholami, J., &amp; Nasiri, S. (2012). A contrastive study of hedging in environmental sciences research articles. Journal of Language Teaching and Research, 3(6), 1186–1193. https://doi.org/10.4304/jltr.3.6.1186-1193</w:t>
       </w:r>
     </w:p>
     <w:p>
       <w:pPr>
         <w:spacing w:after="0" w:before="0" w:line="480" w:lineRule="auto"/>
         <w:ind w:left="720" w:hanging="720"/>
-        <w:jc w:val="both"/>
-        <w:rPr/>
-      </w:pPr>
-      <w:r>
-        <w:rPr>
-          <w:rFonts w:ascii="Georgia" w:cs="Georgia" w:eastAsia="Georgia" w:hAnsi="Georgia"/>
-          <w:i w:val="0"/>
-          <w:iCs w:val="0"/>
-          <w:sz w:val="22"/>
-          <w:szCs w:val="22"/>
-          <w:rtl w:val="0"/>
-        </w:rPr>
-        <w:t xml:space="preserve">Biber, D., Conrad, S., &amp; Reppen, R. (1998). </w:t>
-      </w:r>
-      <w:r>
-        <w:rPr>
-          <w:rFonts w:ascii="Georgia" w:cs="Georgia" w:eastAsia="Georgia" w:hAnsi="Georgia"/>
-          <w:i w:val="1"/>
-          <w:iCs w:val="1"/>
-          <w:sz w:val="22"/>
-          <w:szCs w:val="22"/>
-          <w:rtl w:val="0"/>
-        </w:rPr>
-        <w:t xml:space="preserve">Corpus linguistics: Investigating language structure and use</w:t>
-      </w:r>
-      <w:r>
-        <w:rPr>
-          <w:rFonts w:ascii="Georgia" w:cs="Georgia" w:eastAsia="Georgia" w:hAnsi="Georgia"/>
-          <w:i w:val="0"/>
-          <w:iCs w:val="0"/>
-          <w:sz w:val="22"/>
-          <w:szCs w:val="22"/>
-          <w:rtl w:val="0"/>
-        </w:rPr>
-        <w:t xml:space="preserve">. Cambridge University Press.</w:t>
-      </w:r>
-      <w:r>
-        <w:rPr>
-          <w:rtl w:val="0"/>
-        </w:rPr>
+        <w:jc w:val="left"/>
+        <w:rPr/>
+      </w:pPr>
+      <w:r>
+        <w:rPr>
+          <w:rFonts w:ascii="Georgia" w:hAnsi="Georgia" w:eastAsia="Georgia"/>
+          <w:sz w:val="22"/>
+        </w:rPr>
+        <w:t>Chafidha, L. N., &amp; Mujiyanto, J. (2021). The comparative study of hedges in theses' abstracts written by English and Indonesian graduate programs of Universitas Negeri Semarang. The Journal of Educational Development, 9(2), 91–100.</w:t>
       </w:r>
     </w:p>
     <w:p>
       <w:pPr>
         <w:spacing w:after="0" w:before="0" w:line="480" w:lineRule="auto"/>
         <w:ind w:left="720" w:hanging="720"/>
-        <w:jc w:val="both"/>
-        <w:rPr/>
-      </w:pPr>
-      <w:r>
-        <w:rPr>
-          <w:rFonts w:ascii="Georgia" w:cs="Georgia" w:eastAsia="Georgia" w:hAnsi="Georgia"/>
-          <w:b w:val="0"/>
-          <w:bCs w:val="0"/>
-          <w:i w:val="0"/>
-          <w:iCs w:val="0"/>
-          <w:sz w:val="22"/>
-          <w:szCs w:val="22"/>
-          <w:rtl w:val="0"/>
-        </w:rPr>
-        <w:t xml:space="preserve">Chafidha, L. N., &amp; Mujiyanto, J. (2021). The comparative study of hedges in theses' abstracts written by English and Indonesian graduate programs of Universitas Negeri Semarang. The Journal of Educational Development, 9(2), 91–100.</w:t>
-      </w:r>
-      <w:r>
-        <w:rPr>
-          <w:rtl w:val="0"/>
-        </w:rPr>
+        <w:jc w:val="left"/>
+        <w:rPr/>
+      </w:pPr>
+      <w:r>
+        <w:rPr>
+          <w:rFonts w:ascii="Georgia" w:hAnsi="Georgia" w:eastAsia="Georgia"/>
+          <w:sz w:val="22"/>
+        </w:rPr>
+        <w:t>Crompton, P. (1997). Hedging in academic writing: Some theoretical problems. English for Specific Purposes, 16(4), 271-287. https://doi.org/10.1016/S0889-4906(97)00007-0</w:t>
       </w:r>
     </w:p>
     <w:p>
       <w:pPr>
         <w:spacing w:after="0" w:before="0" w:line="480" w:lineRule="auto"/>
         <w:ind w:left="720" w:hanging="720"/>
-        <w:jc w:val="both"/>
-        <w:rPr/>
-      </w:pPr>
-      <w:r>
-        <w:rPr>
-          <w:rFonts w:ascii="Georgia" w:cs="Georgia" w:eastAsia="Georgia" w:hAnsi="Georgia"/>
-          <w:b w:val="0"/>
-          <w:bCs w:val="0"/>
-          <w:i w:val="0"/>
-          <w:iCs w:val="0"/>
-          <w:sz w:val="22"/>
-          <w:szCs w:val="22"/>
-          <w:rtl w:val="0"/>
-        </w:rPr>
-        <w:t xml:space="preserve">Crompton, P. (1997). Hedging in academic writing: Some theoretical problems. English for Specific Purposes, 16(4), 271-287. </w:t>
-      </w:r>
+        <w:jc w:val="left"/>
+        <w:rPr/>
+      </w:pPr>
       <w:hyperlink r:id="rId12">
         <w:r>
           <w:rPr>
@@ -20540,8 +20464,10 @@
       </w:hyperlink>
       <w:r>
         <w:rPr>
-          <w:rtl w:val="0"/>
-        </w:rPr>
+          <w:rFonts w:ascii="Georgia" w:hAnsi="Georgia" w:eastAsia="Georgia"/>
+          <w:sz w:val="22"/>
+        </w:rPr>
+        <w:t>Demanou, G., &amp; Tabe, C. A. (2022). Disciplinary and move analyses of hedging in abstracts of DIPES II dissertations of the Higher Teachers' Training College of Maroua. International Journal of Applied Linguistics and English Literature, 11(4), 76–86. https://doi.org/10.7575/aiac.ijalel.v.11n.4p.76</w:t>
       </w:r>
     </w:p>
     <w:p>
@@ -20549,48 +20475,24 @@
         <w:pageBreakBefore w:val="1"/>
         <w:spacing w:after="0" w:before="0" w:line="480" w:lineRule="auto"/>
         <w:ind w:left="720" w:hanging="720"/>
-        <w:jc w:val="both"/>
-        <w:rPr/>
-      </w:pPr>
-      <w:r>
-        <w:rPr>
-          <w:rFonts w:ascii="Georgia" w:cs="Georgia" w:eastAsia="Georgia" w:hAnsi="Georgia"/>
-          <w:b w:val="0"/>
-          <w:bCs w:val="0"/>
-          <w:i w:val="0"/>
-          <w:iCs w:val="0"/>
-          <w:sz w:val="22"/>
-          <w:szCs w:val="22"/>
-          <w:rtl w:val="0"/>
-        </w:rPr>
-        <w:t xml:space="preserve">Demanou, G., &amp; Tabe, C. A. (2022). Disciplinary and move analyses of hedging in abstracts of DIPES II dissertations of the Higher Teachers' Training College of Maroua. International Journal of Applied Linguistics and English Literature, 11(4), 76–86. https://doi.org/10.7575/aiac.ijalel.v.11n.4p.76</w:t>
-      </w:r>
-      <w:r>
-        <w:rPr>
-          <w:rtl w:val="0"/>
-        </w:rPr>
+        <w:jc w:val="left"/>
+        <w:rPr/>
+      </w:pPr>
+      <w:r>
+        <w:rPr>
+          <w:rFonts w:ascii="Georgia" w:hAnsi="Georgia" w:eastAsia="Georgia"/>
+          <w:sz w:val="22"/>
+        </w:rPr>
+        <w:t>Demir, C. (2018). Hedging and academic writing: An analysis of lexical hedges. Journal of Language and Linguistic Studies, 14(4), 74-92. https://files.eric.ed.gov/fulltext/EJ1201945.pdf</w:t>
       </w:r>
     </w:p>
     <w:p>
       <w:pPr>
         <w:spacing w:after="0" w:before="0" w:line="480" w:lineRule="auto"/>
         <w:ind w:left="720" w:hanging="720"/>
-        <w:jc w:val="both"/>
-        <w:rPr/>
-      </w:pPr>
-      <w:r>
-        <w:rPr>
-          <w:rFonts w:ascii="Georgia" w:cs="Georgia" w:eastAsia="Georgia" w:hAnsi="Georgia"/>
-          <w:b w:val="0"/>
-          <w:bCs w:val="0"/>
-          <w:i w:val="0"/>
-          <w:iCs w:val="0"/>
-          <w:sz w:val="22"/>
-          <w:szCs w:val="22"/>
-          <w:rtl w:val="0"/>
-        </w:rPr>
-        <w:t xml:space="preserve">Demir, C. (2018). Hedging and academic writing: An analysis of lexical hedges. Journal of Language and Linguistic Studies, 14(4), 74-92. </w:t>
-      </w:r>
+        <w:jc w:val="left"/>
+        <w:rPr/>
+      </w:pPr>
       <w:hyperlink r:id="rId13">
         <w:r>
           <w:rPr>
@@ -20604,56 +20506,34 @@
       </w:hyperlink>
       <w:r>
         <w:rPr>
-          <w:rtl w:val="0"/>
-        </w:rPr>
+          <w:rFonts w:ascii="Georgia" w:hAnsi="Georgia" w:eastAsia="Georgia"/>
+          <w:sz w:val="22"/>
+        </w:rPr>
+        <w:t>Doğan, Z. N., &amp; Akbaş, E. (2021). An exploratory study of epistemic stance in results and discussion sections of medical research articles. Atatürk Üniversitesi Sosyal Bilimler Enstitüsü Dergisi, 25(3), 1132–1150. https://doi.org/10.53487/ataunisosbil.951126</w:t>
       </w:r>
     </w:p>
     <w:p>
       <w:pPr>
         <w:spacing w:after="0" w:before="0" w:line="480" w:lineRule="auto"/>
         <w:ind w:left="720" w:hanging="720"/>
-        <w:jc w:val="both"/>
-        <w:rPr/>
-      </w:pPr>
-      <w:r>
-        <w:rPr>
-          <w:rFonts w:ascii="Georgia" w:cs="Georgia" w:eastAsia="Georgia" w:hAnsi="Georgia"/>
-          <w:b w:val="0"/>
-          <w:bCs w:val="0"/>
-          <w:i w:val="0"/>
-          <w:iCs w:val="0"/>
-          <w:sz w:val="22"/>
-          <w:szCs w:val="22"/>
-          <w:rtl w:val="0"/>
-        </w:rPr>
-        <w:t xml:space="preserve">Doğan, Z. N., &amp; Akbaş, E. (2021). An exploratory study of epistemic stance in results and discussion sections of medical research articles. Atatürk Üniversitesi Sosyal Bilimler Enstitüsü Dergisi, 25(3), 1132–1150. https://doi.org/10.53487/ataunisosbil.951126</w:t>
-      </w:r>
-      <w:r>
-        <w:rPr>
-          <w:rtl w:val="0"/>
-        </w:rPr>
+        <w:jc w:val="left"/>
+        <w:rPr/>
+      </w:pPr>
+      <w:r>
+        <w:rPr>
+          <w:rFonts w:ascii="Georgia" w:hAnsi="Georgia" w:eastAsia="Georgia"/>
+          <w:sz w:val="22"/>
+        </w:rPr>
+        <w:t>Escalona, S. L. (2025). Hedges and boosters in college essays: A study of linguistic modulation in student writing. International Journal of English Literature and Social Sciences, 10(1), 7-17. https://doi.org/10.22161/ijels.101.2</w:t>
       </w:r>
     </w:p>
     <w:p>
       <w:pPr>
         <w:spacing w:after="0" w:before="0" w:line="480" w:lineRule="auto"/>
         <w:ind w:left="720" w:hanging="720"/>
-        <w:jc w:val="both"/>
-        <w:rPr/>
-      </w:pPr>
-      <w:r>
-        <w:rPr>
-          <w:rFonts w:ascii="Georgia" w:cs="Georgia" w:eastAsia="Georgia" w:hAnsi="Georgia"/>
-          <w:b w:val="0"/>
-          <w:bCs w:val="0"/>
-          <w:i w:val="0"/>
-          <w:iCs w:val="0"/>
-          <w:sz w:val="22"/>
-          <w:szCs w:val="22"/>
-          <w:rtl w:val="0"/>
-        </w:rPr>
-        <w:t xml:space="preserve">Escalona, S. L. (2025). Hedges and boosters in college essays: A study of linguistic modulation in student writing. International Journal of English Literature and Social Sciences, 10(1), 7-17. </w:t>
-      </w:r>
+        <w:jc w:val="left"/>
+        <w:rPr/>
+      </w:pPr>
       <w:hyperlink r:id="rId14">
         <w:r>
           <w:rPr>
@@ -20667,30 +20547,19 @@
       </w:hyperlink>
       <w:r>
         <w:rPr>
-          <w:rtl w:val="0"/>
-        </w:rPr>
+          <w:rFonts w:ascii="Georgia" w:hAnsi="Georgia" w:eastAsia="Georgia"/>
+          <w:sz w:val="22"/>
+        </w:rPr>
+        <w:t>Gamad, J. B., Gustilo, L. E., Dimaculangan, N. G., &amp; Dumanig, F. P. (2024). Transitions and hedges: The preferred metadiscourse markers in research articles across English varieties and disciplines. BRU ELT Journal, 2(3), 206–229. https://doi.org/10.14456/bej.2024.15</w:t>
       </w:r>
     </w:p>
     <w:p>
       <w:pPr>
         <w:spacing w:after="0" w:before="0" w:line="480" w:lineRule="auto"/>
         <w:ind w:left="720" w:hanging="720"/>
-        <w:jc w:val="both"/>
-        <w:rPr/>
-      </w:pPr>
-      <w:r>
-        <w:rPr>
-          <w:rFonts w:ascii="Georgia" w:cs="Georgia" w:eastAsia="Georgia" w:hAnsi="Georgia"/>
-          <w:b w:val="0"/>
-          <w:bCs w:val="0"/>
-          <w:i w:val="0"/>
-          <w:iCs w:val="0"/>
-          <w:sz w:val="22"/>
-          <w:szCs w:val="22"/>
-          <w:rtl w:val="0"/>
-        </w:rPr>
-        <w:t xml:space="preserve">Ghia, E., Petrocelli, E., &amp; Pizziconi, S. (2022). Data possibly suggest… Hedging in second language writing: A study on advanced Italian EFL learners. Belgrade English Language and Literature Studies, 14, 47-72. </w:t>
-      </w:r>
+        <w:jc w:val="left"/>
+        <w:rPr/>
+      </w:pPr>
       <w:hyperlink r:id="rId15">
         <w:r>
           <w:rPr>
@@ -20704,60 +20573,40 @@
       </w:hyperlink>
       <w:r>
         <w:rPr>
-          <w:rtl w:val="0"/>
-        </w:rPr>
+          <w:rFonts w:ascii="Georgia" w:hAnsi="Georgia" w:eastAsia="Georgia"/>
+          <w:sz w:val="22"/>
+        </w:rPr>
+        <w:t>Ghia, E., Petrocelli, E., &amp; Pizziconi, S. (2022). Data possibly suggest… Hedging in second language writing: A study on advanced Italian EFL learners. Belgrade English Language and Literature Studies, 14, 47-72. https://doi.org/10.18485/bells.2022.14.2</w:t>
       </w:r>
     </w:p>
     <w:p>
       <w:pPr>
         <w:spacing w:after="0" w:before="0" w:line="480" w:lineRule="auto"/>
         <w:ind w:left="720" w:hanging="720"/>
-        <w:jc w:val="both"/>
-        <w:rPr/>
-      </w:pPr>
-      <w:r>
-        <w:rPr>
-          <w:rFonts w:ascii="Georgia" w:cs="Georgia" w:eastAsia="Georgia" w:hAnsi="Georgia"/>
-          <w:b w:val="0"/>
-          <w:bCs w:val="0"/>
-          <w:i w:val="0"/>
-          <w:iCs w:val="0"/>
-          <w:sz w:val="22"/>
-          <w:szCs w:val="22"/>
-          <w:rtl w:val="0"/>
-        </w:rPr>
-        <w:t xml:space="preserve">Gillaerts, P., &amp; Van de Velde, F. (2010). Interactional metadiscourse in research article abstracts. Journal of English for Academic Purposes, 9(2), 128-139. https://doi.org/10.1016/j.jeap.2010.02.004</w:t>
-      </w:r>
-      <w:r>
-        <w:rPr>
-          <w:rtl w:val="0"/>
-        </w:rPr>
+        <w:jc w:val="left"/>
+        <w:rPr/>
+      </w:pPr>
+      <w:r>
+        <w:rPr>
+          <w:rFonts w:ascii="Georgia" w:hAnsi="Georgia" w:eastAsia="Georgia"/>
+          <w:sz w:val="22"/>
+        </w:rPr>
+        <w:t>Gillaerts, P., &amp; Van de Velde, F. (2010). Interactional metadiscourse in research article abstracts. Journal of English for Academic Purposes, 9(2), 128-139. https://doi.org/10.1016/j.jeap.2010.02.004</w:t>
       </w:r>
     </w:p>
     <w:p>
       <w:pPr>
         <w:spacing w:after="0" w:before="0" w:line="480" w:lineRule="auto"/>
         <w:ind w:left="720" w:hanging="720"/>
-        <w:jc w:val="both"/>
-        <w:rPr/>
-      </w:pPr>
-      <w:r>
-        <w:rPr>
-          <w:rFonts w:ascii="Georgia" w:cs="Georgia" w:eastAsia="Georgia" w:hAnsi="Georgia"/>
-          <w:b w:val="0"/>
-          <w:bCs w:val="0"/>
-          <w:i w:val="0"/>
-          <w:iCs w:val="0"/>
-          <w:sz w:val="22"/>
-          <w:szCs w:val="22"/>
-          <w:rtl w:val="0"/>
-        </w:rPr>
-        <w:t xml:space="preserve">Halabisaz, B., Pazhakh, A., &amp; Shakibafar, M. (2014). Hedging in thesis abstracts on applied linguistics across Persian and English. International Review of Social Sciences and Humanities, 7(1), 211–218. https://www.irssh.com/yahoo_site_admin/assets/docs/20_IRSSH-841-V7N1.131231112.pdf</w:t>
-      </w:r>
-      <w:r>
-        <w:rPr>
-          <w:rtl w:val="0"/>
-        </w:rPr>
+        <w:jc w:val="left"/>
+        <w:rPr/>
+      </w:pPr>
+      <w:r>
+        <w:rPr>
+          <w:rFonts w:ascii="Georgia" w:hAnsi="Georgia" w:eastAsia="Georgia"/>
+          <w:sz w:val="22"/>
+        </w:rPr>
+        <w:t>Grengia, F. P. (2025). Hedging stance: A corpus-based study of editorial articles in student publications. International Journal of Academic Multidisciplinary Research, 9(5), 306–310.</w:t>
       </w:r>
     </w:p>
     <w:p>
@@ -20765,42 +20614,9 @@
         <w:pageBreakBefore w:val="1"/>
         <w:spacing w:after="0" w:before="0" w:line="480" w:lineRule="auto"/>
         <w:ind w:left="720" w:hanging="720"/>
-        <w:jc w:val="both"/>
-        <w:rPr/>
-      </w:pPr>
-      <w:r>
-        <w:rPr>
-          <w:rFonts w:ascii="Georgia" w:cs="Georgia" w:eastAsia="Georgia" w:hAnsi="Georgia"/>
-          <w:i w:val="0"/>
-          <w:iCs w:val="0"/>
-          <w:sz w:val="22"/>
-          <w:szCs w:val="22"/>
-          <w:rtl w:val="0"/>
-        </w:rPr>
-        <w:t xml:space="preserve">Hamidi, H., Najafi Sarem, S., &amp; Lotfi, A. H. (2025). Exploring hedging devices in scientific research papers: A content analysis study of the Medical Journal of the Islamic Republic of Iran. </w:t>
-      </w:r>
-      <w:r>
-        <w:rPr>
-          <w:rFonts w:ascii="Georgia" w:cs="Georgia" w:eastAsia="Georgia" w:hAnsi="Georgia"/>
-          <w:i w:val="1"/>
-          <w:iCs w:val="1"/>
-          <w:sz w:val="22"/>
-          <w:szCs w:val="22"/>
-          <w:rtl w:val="0"/>
-        </w:rPr>
-        <w:t xml:space="preserve">Medical Journal of the Islamic Republic of Iran, 39</w:t>
-      </w:r>
-      <w:r>
-        <w:rPr>
-          <w:rFonts w:ascii="Georgia" w:cs="Georgia" w:eastAsia="Georgia" w:hAnsi="Georgia"/>
-          <w:i w:val="0"/>
-          <w:iCs w:val="0"/>
-          <w:sz w:val="22"/>
-          <w:szCs w:val="22"/>
-          <w:rtl w:val="0"/>
-        </w:rPr>
-        <w:t xml:space="preserve">, Article 125. </w:t>
-      </w:r>
+        <w:jc w:val="left"/>
+        <w:rPr/>
+      </w:pPr>
       <w:hyperlink r:id="rId16">
         <w:r>
           <w:rPr>
@@ -20814,56 +20630,34 @@
       </w:hyperlink>
       <w:r>
         <w:rPr>
-          <w:rtl w:val="0"/>
-        </w:rPr>
+          <w:rFonts w:ascii="Georgia" w:hAnsi="Georgia" w:eastAsia="Georgia"/>
+          <w:sz w:val="22"/>
+        </w:rPr>
+        <w:t>Halabisaz, B., Pazhakh, A., &amp; Shakibafar, M. (2014). Hedging in thesis abstracts on applied linguistics across Persian and English. International Review of Social Sciences and Humanities, 7(1), 211–218. https://www.irssh.com/yahoo_site_admin/assets/docs/20_IRSSH-841-V7N1.131231112.pdf</w:t>
       </w:r>
     </w:p>
     <w:p>
       <w:pPr>
         <w:spacing w:after="0" w:before="0" w:line="480" w:lineRule="auto"/>
         <w:ind w:left="720" w:hanging="720"/>
-        <w:jc w:val="both"/>
-        <w:rPr/>
-      </w:pPr>
-      <w:r>
-        <w:rPr>
-          <w:rFonts w:ascii="Georgia" w:cs="Georgia" w:eastAsia="Georgia" w:hAnsi="Georgia"/>
-          <w:b w:val="0"/>
-          <w:bCs w:val="0"/>
-          <w:i w:val="0"/>
-          <w:iCs w:val="0"/>
-          <w:sz w:val="22"/>
-          <w:szCs w:val="22"/>
-          <w:rtl w:val="0"/>
-        </w:rPr>
-        <w:t xml:space="preserve">Hinkel, E. (2005). Hedging, inflating, and persuading in L2 academic writing. Applied Language Learning, 15(1–2), 29–53.</w:t>
-      </w:r>
-      <w:r>
-        <w:rPr>
-          <w:rtl w:val="0"/>
-        </w:rPr>
+        <w:jc w:val="left"/>
+        <w:rPr/>
+      </w:pPr>
+      <w:r>
+        <w:rPr>
+          <w:rFonts w:ascii="Georgia" w:hAnsi="Georgia" w:eastAsia="Georgia"/>
+          <w:sz w:val="22"/>
+        </w:rPr>
+        <w:t>Hamidi, H., Najafi Sarem, S., &amp; Lotfi, A. H. (2025). Exploring hedging devices in scientific research papers: A content analysis study of the Medical Journal of the Islamic Republic of Iran. Medical Journal of the Islamic Republic of Iran, 39, Article 125. https://pmc.ncbi.nlm.nih.gov/articles/PMC12584097/</w:t>
       </w:r>
     </w:p>
     <w:p>
       <w:pPr>
         <w:spacing w:after="0" w:before="0" w:line="480" w:lineRule="auto"/>
         <w:ind w:left="720" w:hanging="720"/>
-        <w:jc w:val="both"/>
-        <w:rPr/>
-      </w:pPr>
-      <w:r>
-        <w:rPr>
-          <w:rFonts w:ascii="Georgia" w:cs="Georgia" w:eastAsia="Georgia" w:hAnsi="Georgia"/>
-          <w:b w:val="0"/>
-          <w:bCs w:val="0"/>
-          <w:i w:val="0"/>
-          <w:iCs w:val="0"/>
-          <w:sz w:val="22"/>
-          <w:szCs w:val="22"/>
-          <w:rtl w:val="0"/>
-        </w:rPr>
-        <w:t xml:space="preserve">Hu, G., &amp; Cao, F. (2011). Hedging and boosting in abstracts of applied linguistics articles: A comparative study of English- and Chinese-medium journals. Journal of Pragmatics, 43(11), 2795-2809. </w:t>
-      </w:r>
+        <w:jc w:val="left"/>
+        <w:rPr/>
+      </w:pPr>
       <w:hyperlink r:id="rId17">
         <w:r>
           <w:rPr>
@@ -20877,82 +20671,49 @@
       </w:hyperlink>
       <w:r>
         <w:rPr>
-          <w:rtl w:val="0"/>
-        </w:rPr>
+          <w:rFonts w:ascii="Georgia" w:hAnsi="Georgia" w:eastAsia="Georgia"/>
+          <w:sz w:val="22"/>
+        </w:rPr>
+        <w:t>Hinkel, E. (2005). Hedging, inflating, and persuading in L2 academic writing. Applied Language Learning, 15(1–2), 29–53.</w:t>
       </w:r>
     </w:p>
     <w:p>
       <w:pPr>
         <w:spacing w:after="0" w:before="0" w:line="480" w:lineRule="auto"/>
         <w:ind w:left="720" w:hanging="720"/>
-        <w:jc w:val="both"/>
-        <w:rPr/>
-      </w:pPr>
-      <w:r>
-        <w:rPr>
-          <w:rFonts w:ascii="Georgia" w:cs="Georgia" w:eastAsia="Georgia" w:hAnsi="Georgia"/>
-          <w:b w:val="0"/>
-          <w:bCs w:val="0"/>
-          <w:i w:val="0"/>
-          <w:iCs w:val="0"/>
-          <w:sz w:val="22"/>
-          <w:szCs w:val="22"/>
-          <w:rtl w:val="0"/>
-        </w:rPr>
-        <w:t xml:space="preserve">Hyland, K. (1996a). Talking to the Academy: Forms of hedging in science research articles. Written Communication, 13(2), 251-281. https://doi.org/10.1177/0741088396013002004</w:t>
-      </w:r>
-      <w:r>
-        <w:rPr>
-          <w:rtl w:val="0"/>
-        </w:rPr>
+        <w:jc w:val="left"/>
+        <w:rPr/>
+      </w:pPr>
+      <w:r>
+        <w:rPr>
+          <w:rFonts w:ascii="Georgia" w:hAnsi="Georgia" w:eastAsia="Georgia"/>
+          <w:sz w:val="22"/>
+        </w:rPr>
+        <w:t>Hu, G., &amp; Cao, F. (2011). Hedging and boosting in abstracts of applied linguistics articles: A comparative study of English- and Chinese-medium journals. Journal of Pragmatics, 43(11), 2795-2809. https://doi.org/10.1016/j.pragma.2011.04.007</w:t>
       </w:r>
     </w:p>
     <w:p>
       <w:pPr>
         <w:spacing w:after="0" w:before="0" w:line="480" w:lineRule="auto"/>
         <w:ind w:left="720" w:hanging="720"/>
-        <w:jc w:val="both"/>
-        <w:rPr/>
-      </w:pPr>
-      <w:r>
-        <w:rPr>
-          <w:rFonts w:ascii="Georgia" w:cs="Georgia" w:eastAsia="Georgia" w:hAnsi="Georgia"/>
-          <w:b w:val="0"/>
-          <w:bCs w:val="0"/>
-          <w:i w:val="0"/>
-          <w:iCs w:val="0"/>
-          <w:sz w:val="22"/>
-          <w:szCs w:val="22"/>
-          <w:rtl w:val="0"/>
-        </w:rPr>
-        <w:t xml:space="preserve">Hyland, K. (1996b). Writing without conviction? Hedging in science research articles. Applied Linguistics, 17(4), 433-454. https://doi.org/10.1093/applin/17.4.433</w:t>
-      </w:r>
-      <w:r>
-        <w:rPr>
-          <w:rtl w:val="0"/>
-        </w:rPr>
+        <w:jc w:val="left"/>
+        <w:rPr/>
+      </w:pPr>
+      <w:r>
+        <w:rPr>
+          <w:rFonts w:ascii="Georgia" w:hAnsi="Georgia" w:eastAsia="Georgia"/>
+          <w:sz w:val="22"/>
+        </w:rPr>
+        <w:t>Hyland, K. (1994). Hedging in academic writing and EAP textbooks. English for Specific Purposes, 13(3), 239–256. https://doi.org/10.1016/0889-4906(94)90004-3</w:t>
       </w:r>
     </w:p>
     <w:p>
       <w:pPr>
         <w:spacing w:after="0" w:before="0" w:line="480" w:lineRule="auto"/>
         <w:ind w:left="720" w:hanging="720"/>
-        <w:jc w:val="both"/>
-        <w:rPr/>
-      </w:pPr>
-      <w:r>
-        <w:rPr>
-          <w:rFonts w:ascii="Georgia" w:cs="Georgia" w:eastAsia="Georgia" w:hAnsi="Georgia"/>
-          <w:b w:val="0"/>
-          <w:bCs w:val="0"/>
-          <w:i w:val="0"/>
-          <w:iCs w:val="0"/>
-          <w:sz w:val="22"/>
-          <w:szCs w:val="22"/>
-          <w:rtl w:val="0"/>
-        </w:rPr>
-        <w:t xml:space="preserve">Hyland, K., &amp; Milton, J. (1997). Qualification and certainty in L1 and L2 students’ writing. Journal of Second Language Writing, 6(2), 183-205. </w:t>
-      </w:r>
+        <w:jc w:val="left"/>
+        <w:rPr/>
+      </w:pPr>
       <w:hyperlink r:id="rId18">
         <w:r>
           <w:rPr>
@@ -20966,76 +20727,34 @@
       </w:hyperlink>
       <w:r>
         <w:rPr>
-          <w:rtl w:val="0"/>
-        </w:rPr>
+          <w:rFonts w:ascii="Georgia" w:hAnsi="Georgia" w:eastAsia="Georgia"/>
+          <w:sz w:val="22"/>
+        </w:rPr>
+        <w:t>Hyland, K. (1996a). Talking to the Academy: Forms of hedging in science research articles. Written Communication, 13(2), 251-281. https://doi.org/10.1177/0741088396013002004</w:t>
       </w:r>
     </w:p>
     <w:p>
       <w:pPr>
         <w:spacing w:after="0" w:before="0" w:line="480" w:lineRule="auto"/>
         <w:ind w:left="720" w:hanging="720"/>
-        <w:jc w:val="both"/>
-        <w:rPr/>
-      </w:pPr>
-      <w:r>
-        <w:rPr>
-          <w:rFonts w:ascii="Georgia" w:cs="Georgia" w:eastAsia="Georgia" w:hAnsi="Georgia"/>
-          <w:i w:val="0"/>
-          <w:iCs w:val="0"/>
-          <w:sz w:val="22"/>
-          <w:szCs w:val="22"/>
-          <w:rtl w:val="0"/>
-        </w:rPr>
-        <w:t xml:space="preserve">Hyland, K. (1998). </w:t>
-      </w:r>
-      <w:r>
-        <w:rPr>
-          <w:rFonts w:ascii="Georgia" w:cs="Georgia" w:eastAsia="Georgia" w:hAnsi="Georgia"/>
-          <w:i w:val="1"/>
-          <w:iCs w:val="1"/>
-          <w:sz w:val="22"/>
-          <w:szCs w:val="22"/>
-          <w:rtl w:val="0"/>
-        </w:rPr>
-        <w:t xml:space="preserve">Hedging in scientific research articles</w:t>
-      </w:r>
-      <w:r>
-        <w:rPr>
-          <w:rFonts w:ascii="Georgia" w:cs="Georgia" w:eastAsia="Georgia" w:hAnsi="Georgia"/>
-          <w:i w:val="0"/>
-          <w:iCs w:val="0"/>
-          <w:sz w:val="22"/>
-          <w:szCs w:val="22"/>
-          <w:rtl w:val="0"/>
-        </w:rPr>
-        <w:t xml:space="preserve">. John Benjamins Publishing.</w:t>
-      </w:r>
-      <w:r>
-        <w:rPr>
-          <w:rtl w:val="0"/>
-        </w:rPr>
+        <w:jc w:val="left"/>
+        <w:rPr/>
+      </w:pPr>
+      <w:r>
+        <w:rPr>
+          <w:rFonts w:ascii="Georgia" w:hAnsi="Georgia" w:eastAsia="Georgia"/>
+          <w:sz w:val="22"/>
+        </w:rPr>
+        <w:t>Hyland, K. (1996b). Writing without conviction? Hedging in science research articles. Applied Linguistics, 17(4), 433-454. https://doi.org/10.1093/applin/17.4.433</w:t>
       </w:r>
     </w:p>
     <w:p>
       <w:pPr>
         <w:spacing w:after="0" w:before="0" w:line="480" w:lineRule="auto"/>
         <w:ind w:left="720" w:hanging="720"/>
-        <w:jc w:val="both"/>
-        <w:rPr/>
-      </w:pPr>
-      <w:r>
-        <w:rPr>
-          <w:rFonts w:ascii="Georgia" w:cs="Georgia" w:eastAsia="Georgia" w:hAnsi="Georgia"/>
-          <w:b w:val="0"/>
-          <w:bCs w:val="0"/>
-          <w:i w:val="0"/>
-          <w:iCs w:val="0"/>
-          <w:sz w:val="22"/>
-          <w:szCs w:val="22"/>
-          <w:rtl w:val="0"/>
-        </w:rPr>
-        <w:t xml:space="preserve">Hyland, K. (2005). Stance and engagement: A model of interaction in academic discourse. Discourse Studies, 7(2), 173-192. </w:t>
-      </w:r>
+        <w:jc w:val="left"/>
+        <w:rPr/>
+      </w:pPr>
       <w:hyperlink r:id="rId19">
         <w:r>
           <w:rPr>
@@ -21049,30 +20768,19 @@
       </w:hyperlink>
       <w:r>
         <w:rPr>
-          <w:rtl w:val="0"/>
-        </w:rPr>
+          <w:rFonts w:ascii="Georgia" w:hAnsi="Georgia" w:eastAsia="Georgia"/>
+          <w:sz w:val="22"/>
+        </w:rPr>
+        <w:t>Hyland, K., &amp; Milton, J. (1997). Qualification and certainty in L1 and L2 students’ writing. Journal of Second Language Writing, 6(2), 183-205. https://doi.org/10.1016/S1060-3743(97)90033-3</w:t>
       </w:r>
     </w:p>
     <w:p>
       <w:pPr>
         <w:spacing w:after="0" w:before="0" w:line="480" w:lineRule="auto"/>
         <w:ind w:left="720" w:hanging="720"/>
-        <w:jc w:val="both"/>
-        <w:rPr/>
-      </w:pPr>
-      <w:r>
-        <w:rPr>
-          <w:rFonts w:ascii="Georgia" w:cs="Georgia" w:eastAsia="Georgia" w:hAnsi="Georgia"/>
-          <w:b w:val="0"/>
-          <w:bCs w:val="0"/>
-          <w:i w:val="0"/>
-          <w:iCs w:val="0"/>
-          <w:sz w:val="22"/>
-          <w:szCs w:val="22"/>
-          <w:rtl w:val="0"/>
-        </w:rPr>
-        <w:t xml:space="preserve">Imataki, N., &amp; Kobayashi, Y. (2024). Analyzing disciplinary variation in abstracts: Linguistic features across scientific and technical fields. Linguistics and Literature Studies, 12(3), 19-28. </w:t>
-      </w:r>
+        <w:jc w:val="left"/>
+        <w:rPr/>
+      </w:pPr>
       <w:hyperlink r:id="rId20">
         <w:r>
           <w:rPr>
@@ -21086,8 +20794,10 @@
       </w:hyperlink>
       <w:r>
         <w:rPr>
-          <w:rtl w:val="0"/>
-        </w:rPr>
+          <w:rFonts w:ascii="Georgia" w:hAnsi="Georgia" w:eastAsia="Georgia"/>
+          <w:sz w:val="22"/>
+        </w:rPr>
+        <w:t>Hyland, K. (1998). Hedging in scientific research articles. John Benjamins Publishing.</w:t>
       </w:r>
     </w:p>
     <w:p>
@@ -21095,22 +20805,9 @@
         <w:pageBreakBefore w:val="1"/>
         <w:spacing w:after="0" w:before="0" w:line="480" w:lineRule="auto"/>
         <w:ind w:left="720" w:hanging="720"/>
-        <w:jc w:val="both"/>
-        <w:rPr/>
-      </w:pPr>
-      <w:r>
-        <w:rPr>
-          <w:rFonts w:ascii="Georgia" w:cs="Georgia" w:eastAsia="Georgia" w:hAnsi="Georgia"/>
-          <w:b w:val="0"/>
-          <w:bCs w:val="0"/>
-          <w:i w:val="0"/>
-          <w:iCs w:val="0"/>
-          <w:sz w:val="22"/>
-          <w:szCs w:val="22"/>
-          <w:rtl w:val="0"/>
-        </w:rPr>
-        <w:t xml:space="preserve">Khunasathitchai, K., Sittironnarit, S., Sinturat, T., &amp; Kumdee, S. (2025). Move analysis and hedge use in the research paper abstracts of Thai EFL English-majored undergraduates. rEFLections, 32(2), 951-973. </w:t>
-      </w:r>
+        <w:jc w:val="left"/>
+        <w:rPr/>
+      </w:pPr>
       <w:hyperlink r:id="rId21">
         <w:r>
           <w:rPr>
@@ -21124,56 +20821,34 @@
       </w:hyperlink>
       <w:r>
         <w:rPr>
-          <w:rtl w:val="0"/>
-        </w:rPr>
+          <w:rFonts w:ascii="Georgia" w:hAnsi="Georgia" w:eastAsia="Georgia"/>
+          <w:sz w:val="22"/>
+        </w:rPr>
+        <w:t>Hyland, K. (2005). Stance and engagement: A model of interaction in academic discourse. Discourse Studies, 7(2), 173-192. https://doi.org/10.1177/1461445605050365</w:t>
       </w:r>
     </w:p>
     <w:p>
       <w:pPr>
         <w:spacing w:after="0" w:before="0" w:line="480" w:lineRule="auto"/>
         <w:ind w:left="720" w:hanging="720"/>
-        <w:jc w:val="both"/>
-        <w:rPr/>
-      </w:pPr>
-      <w:r>
-        <w:rPr>
-          <w:rFonts w:ascii="Georgia" w:cs="Georgia" w:eastAsia="Georgia" w:hAnsi="Georgia"/>
-          <w:b w:val="0"/>
-          <w:bCs w:val="0"/>
-          <w:i w:val="0"/>
-          <w:iCs w:val="0"/>
-          <w:sz w:val="22"/>
-          <w:szCs w:val="22"/>
-          <w:rtl w:val="0"/>
-        </w:rPr>
-        <w:t xml:space="preserve">Lingard, L. (2026). Rhetorical candour: When and how to say it straight in your academic manuscript. Perspectives on Medical Education, 15(1), 251–256. https://doi.org/10.5334/pme.2269</w:t>
-      </w:r>
-      <w:r>
-        <w:rPr>
-          <w:rtl w:val="0"/>
-        </w:rPr>
+        <w:jc w:val="left"/>
+        <w:rPr/>
+      </w:pPr>
+      <w:r>
+        <w:rPr>
+          <w:rFonts w:ascii="Georgia" w:hAnsi="Georgia" w:eastAsia="Georgia"/>
+          <w:sz w:val="22"/>
+        </w:rPr>
+        <w:t>Imataki, N., &amp; Kobayashi, Y. (2024). Analyzing disciplinary variation in abstracts: Linguistic features across scientific and technical fields. Linguistics and Literature Studies, 12(3), 19-28. https://doi.org/10.13189/lls.2024.120301</w:t>
       </w:r>
     </w:p>
     <w:p>
       <w:pPr>
         <w:spacing w:after="0" w:before="0" w:line="480" w:lineRule="auto"/>
         <w:ind w:left="720" w:hanging="720"/>
-        <w:jc w:val="both"/>
-        <w:rPr/>
-      </w:pPr>
-      <w:r>
-        <w:rPr>
-          <w:rFonts w:ascii="Georgia" w:cs="Georgia" w:eastAsia="Georgia" w:hAnsi="Georgia"/>
-          <w:b w:val="0"/>
-          <w:bCs w:val="0"/>
-          <w:i w:val="0"/>
-          <w:iCs w:val="0"/>
-          <w:sz w:val="22"/>
-          <w:szCs w:val="22"/>
-          <w:rtl w:val="0"/>
-        </w:rPr>
-        <w:t xml:space="preserve">Lopez, R. M. C., Pedida, J. A., Alzate, L. J. A., &amp; Eustaquio, M. T. L. (2025). Language of caution and certainty: Writing proficiency in hedges and boosters in student essays. International Journal of Research and Innovation in Social Science, 9(11), 6176-6196. </w:t>
-      </w:r>
+        <w:jc w:val="left"/>
+        <w:rPr/>
+      </w:pPr>
       <w:hyperlink r:id="rId22">
         <w:r>
           <w:rPr>
@@ -21187,56 +20862,34 @@
       </w:hyperlink>
       <w:r>
         <w:rPr>
-          <w:rtl w:val="0"/>
-        </w:rPr>
+          <w:rFonts w:ascii="Georgia" w:hAnsi="Georgia" w:eastAsia="Georgia"/>
+          <w:sz w:val="22"/>
+        </w:rPr>
+        <w:t>Khunasathitchai, K., Sittironnarit, S., Sinturat, T., &amp; Kumdee, S. (2025). Move analysis and hedge use in the research paper abstracts of Thai EFL English-majored undergraduates. rEFLections, 32(2), 951-973. https://doi.org/10.61508/refl.v32i2.282512</w:t>
       </w:r>
     </w:p>
     <w:p>
       <w:pPr>
         <w:spacing w:after="0" w:before="0" w:line="480" w:lineRule="auto"/>
         <w:ind w:left="720" w:hanging="720"/>
-        <w:jc w:val="both"/>
-        <w:rPr/>
-      </w:pPr>
-      <w:r>
-        <w:rPr>
-          <w:rFonts w:ascii="Georgia" w:cs="Georgia" w:eastAsia="Georgia" w:hAnsi="Georgia"/>
-          <w:b w:val="0"/>
-          <w:bCs w:val="0"/>
-          <w:i w:val="0"/>
-          <w:iCs w:val="0"/>
-          <w:sz w:val="22"/>
-          <w:szCs w:val="22"/>
-          <w:rtl w:val="0"/>
-        </w:rPr>
-        <w:t xml:space="preserve">Luo, S. (2021). A systematic review of undergraduate English language learners’ use of hedging in English academic writing [Capstone paper, Vanderbilt University].</w:t>
-      </w:r>
-      <w:r>
-        <w:rPr>
-          <w:rtl w:val="0"/>
-        </w:rPr>
+        <w:jc w:val="left"/>
+        <w:rPr/>
+      </w:pPr>
+      <w:r>
+        <w:rPr>
+          <w:rFonts w:ascii="Georgia" w:hAnsi="Georgia" w:eastAsia="Georgia"/>
+          <w:sz w:val="22"/>
+        </w:rPr>
+        <w:t>Lingard, L. (2026). Rhetorical candour: When and how to say it straight in your academic manuscript. Perspectives on Medical Education, 15(1), 251–256. https://doi.org/10.5334/pme.2269</w:t>
       </w:r>
     </w:p>
     <w:p>
       <w:pPr>
         <w:spacing w:after="0" w:before="0" w:line="480" w:lineRule="auto"/>
         <w:ind w:left="720" w:hanging="720"/>
-        <w:jc w:val="both"/>
-        <w:rPr/>
-      </w:pPr>
-      <w:r>
-        <w:rPr>
-          <w:rFonts w:ascii="Georgia" w:cs="Georgia" w:eastAsia="Georgia" w:hAnsi="Georgia"/>
-          <w:b w:val="0"/>
-          <w:bCs w:val="0"/>
-          <w:i w:val="0"/>
-          <w:iCs w:val="0"/>
-          <w:sz w:val="22"/>
-          <w:szCs w:val="22"/>
-          <w:rtl w:val="0"/>
-        </w:rPr>
-        <w:t xml:space="preserve">Mazidah, E. N., Cahyani, W. I., &amp; Masruroh, L. (2022). Hedges and boosters in undergraduate thesis abstracts of Qomaruddin University students. Journal of Education, Humaniora and Social Sciences (JEHSS), 4(3), 1657-1663. </w:t>
-      </w:r>
+        <w:jc w:val="left"/>
+        <w:rPr/>
+      </w:pPr>
       <w:hyperlink r:id="rId23">
         <w:r>
           <w:rPr>
@@ -21250,50 +20903,19 @@
       </w:hyperlink>
       <w:r>
         <w:rPr>
-          <w:rtl w:val="0"/>
-        </w:rPr>
+          <w:rFonts w:ascii="Georgia" w:hAnsi="Georgia" w:eastAsia="Georgia"/>
+          <w:sz w:val="22"/>
+        </w:rPr>
+        <w:t>Loi, C. K., &amp; Lim, J. M.-H. (2015). Hedging in academic writing: A pedagogically-motivated qualitative study. Procedia - Social and Behavioral Sciences, 197, 600–607. https://doi.org/10.1016/j.sbspro.2015.07.200</w:t>
       </w:r>
     </w:p>
     <w:p>
       <w:pPr>
         <w:spacing w:after="0" w:before="0" w:line="480" w:lineRule="auto"/>
         <w:ind w:left="720" w:hanging="720"/>
-        <w:jc w:val="both"/>
-        <w:rPr/>
-      </w:pPr>
-      <w:r>
-        <w:rPr>
-          <w:rFonts w:ascii="Georgia" w:cs="Georgia" w:eastAsia="Georgia" w:hAnsi="Georgia"/>
-          <w:i w:val="0"/>
-          <w:iCs w:val="0"/>
-          <w:sz w:val="22"/>
-          <w:szCs w:val="22"/>
-          <w:rtl w:val="0"/>
-        </w:rPr>
-        <w:t xml:space="preserve">Mohammed, S. J. (2011). </w:t>
-      </w:r>
-      <w:r>
-        <w:rPr>
-          <w:rFonts w:ascii="Georgia" w:cs="Georgia" w:eastAsia="Georgia" w:hAnsi="Georgia"/>
-          <w:i w:val="1"/>
-          <w:iCs w:val="1"/>
-          <w:sz w:val="22"/>
-          <w:szCs w:val="22"/>
-          <w:rtl w:val="0"/>
-        </w:rPr>
-        <w:t xml:space="preserve">Lexical hedges: A study of cultural and disciplinary variation in academic research articles</w:t>
-      </w:r>
-      <w:r>
-        <w:rPr>
-          <w:rFonts w:ascii="Georgia" w:cs="Georgia" w:eastAsia="Georgia" w:hAnsi="Georgia"/>
-          <w:i w:val="0"/>
-          <w:iCs w:val="0"/>
-          <w:sz w:val="22"/>
-          <w:szCs w:val="22"/>
-          <w:rtl w:val="0"/>
-        </w:rPr>
-        <w:t xml:space="preserve"> [Master’s thesis, Universiti Teknologi MARA]. CORE. </w:t>
-      </w:r>
+        <w:jc w:val="left"/>
+        <w:rPr/>
+      </w:pPr>
       <w:hyperlink r:id="rId24">
         <w:r>
           <w:rPr>
@@ -21307,30 +20929,19 @@
       </w:hyperlink>
       <w:r>
         <w:rPr>
-          <w:rtl w:val="0"/>
-        </w:rPr>
+          <w:rFonts w:ascii="Georgia" w:hAnsi="Georgia" w:eastAsia="Georgia"/>
+          <w:sz w:val="22"/>
+        </w:rPr>
+        <w:t>Lopez, R. M. C., Pedida, J. A., Alzate, L. J. A., &amp; Eustaquio, M. T. L. (2025). Language of caution and certainty: Writing proficiency in hedges and boosters in student essays. International Journal of Research and Innovation in Social Science, 9(11), 6176-6196. https://doi.org/10.47772/IJRISS.2025.91100485</w:t>
       </w:r>
     </w:p>
     <w:p>
       <w:pPr>
         <w:spacing w:after="0" w:before="0" w:line="480" w:lineRule="auto"/>
         <w:ind w:left="720" w:hanging="720"/>
-        <w:jc w:val="both"/>
-        <w:rPr/>
-      </w:pPr>
-      <w:r>
-        <w:rPr>
-          <w:rFonts w:ascii="Georgia" w:cs="Georgia" w:eastAsia="Georgia" w:hAnsi="Georgia"/>
-          <w:b w:val="0"/>
-          <w:bCs w:val="0"/>
-          <w:i w:val="0"/>
-          <w:iCs w:val="0"/>
-          <w:sz w:val="22"/>
-          <w:szCs w:val="22"/>
-          <w:rtl w:val="0"/>
-        </w:rPr>
-        <w:t xml:space="preserve">Ningrum, S., Puspita, H., &amp; Mulyadi, A. I. (2024). Hedges and boosters in academic writing of ASEAN EFL learners. Journal of English Education and Teaching, 8(1), 202-218. </w:t>
-      </w:r>
+        <w:jc w:val="left"/>
+        <w:rPr/>
+      </w:pPr>
       <w:hyperlink r:id="rId25">
         <w:r>
           <w:rPr>
@@ -21344,30 +20955,19 @@
       </w:hyperlink>
       <w:r>
         <w:rPr>
-          <w:rtl w:val="0"/>
-        </w:rPr>
+          <w:rFonts w:ascii="Georgia" w:hAnsi="Georgia" w:eastAsia="Georgia"/>
+          <w:sz w:val="22"/>
+        </w:rPr>
+        <w:t>Luo, S. (2021). A systematic review of undergraduate English language learners’ use of hedging in English academic writing [Capstone paper, Vanderbilt University].</w:t>
       </w:r>
     </w:p>
     <w:p>
       <w:pPr>
         <w:spacing w:after="0" w:before="0" w:line="480" w:lineRule="auto"/>
         <w:ind w:left="720" w:hanging="720"/>
-        <w:jc w:val="both"/>
-        <w:rPr/>
-      </w:pPr>
-      <w:r>
-        <w:rPr>
-          <w:rFonts w:ascii="Georgia" w:cs="Georgia" w:eastAsia="Georgia" w:hAnsi="Georgia"/>
-          <w:b w:val="0"/>
-          <w:bCs w:val="0"/>
-          <w:i w:val="0"/>
-          <w:iCs w:val="0"/>
-          <w:sz w:val="22"/>
-          <w:szCs w:val="22"/>
-          <w:rtl w:val="0"/>
-        </w:rPr>
-        <w:t xml:space="preserve">Petchkij, W. (2019). Explicit teaching of hedges: Bringing hedging in academic writing into the Thai EFL classroom. Electronic Journal of Foreign Language Teaching, 16(1), 95-113. </w:t>
-      </w:r>
+        <w:jc w:val="left"/>
+        <w:rPr/>
+      </w:pPr>
       <w:hyperlink r:id="rId26">
         <w:r>
           <w:rPr>
@@ -21381,82 +20981,49 @@
       </w:hyperlink>
       <w:r>
         <w:rPr>
-          <w:rtl w:val="0"/>
-        </w:rPr>
+          <w:rFonts w:ascii="Georgia" w:hAnsi="Georgia" w:eastAsia="Georgia"/>
+          <w:sz w:val="22"/>
+        </w:rPr>
+        <w:t>Luyun, C. (2024). Language support for academic writing: Exploring the use of hedges and boosters in student research and designing language interventions. Contemporary Research in Education and English Language Teaching, 6(1), 84–104.</w:t>
       </w:r>
     </w:p>
     <w:p>
       <w:pPr>
         <w:spacing w:after="0" w:before="0" w:line="480" w:lineRule="auto"/>
         <w:ind w:left="720" w:hanging="720"/>
-        <w:jc w:val="both"/>
-        <w:rPr/>
-      </w:pPr>
-      <w:r>
-        <w:rPr>
-          <w:rFonts w:ascii="Georgia" w:cs="Georgia" w:eastAsia="Georgia" w:hAnsi="Georgia"/>
-          <w:b w:val="0"/>
-          <w:bCs w:val="0"/>
-          <w:i w:val="0"/>
-          <w:iCs w:val="0"/>
-          <w:sz w:val="22"/>
-          <w:szCs w:val="22"/>
-          <w:rtl w:val="0"/>
-        </w:rPr>
-        <w:t xml:space="preserve">Qiu, X., Wang, Y. (A.), Dartey, E. A., &amp; Kim, M. (2024). Interactional metadiscourse in expert and student disciplinary writing: Exploring intrageneric and functional variation. English for Specific Purposes, 73, 124-140. https://doi.org/10.1016/j.esp.2023.10.007</w:t>
-      </w:r>
-      <w:r>
-        <w:rPr>
-          <w:rtl w:val="0"/>
-        </w:rPr>
+        <w:jc w:val="left"/>
+        <w:rPr/>
+      </w:pPr>
+      <w:r>
+        <w:rPr>
+          <w:rFonts w:ascii="Georgia" w:hAnsi="Georgia" w:eastAsia="Georgia"/>
+          <w:sz w:val="22"/>
+        </w:rPr>
+        <w:t>Magday, W. D., Jr., Pelaez, M. R., &amp; Valdez, R. R. (2026). A corpus-based comparison of hedging in research articles: Filipino and Thai contexts. International Journal of Learning, Teaching and Educational Research, 25(5), 956–968. https://doi.org/10.26803/ijlter.25.5.42</w:t>
       </w:r>
     </w:p>
     <w:p>
       <w:pPr>
         <w:spacing w:after="0" w:before="0" w:line="480" w:lineRule="auto"/>
         <w:ind w:left="720" w:hanging="720"/>
-        <w:jc w:val="both"/>
-        <w:rPr/>
-      </w:pPr>
-      <w:r>
-        <w:rPr>
-          <w:rFonts w:ascii="Georgia" w:cs="Georgia" w:eastAsia="Georgia" w:hAnsi="Georgia"/>
-          <w:b w:val="0"/>
-          <w:bCs w:val="0"/>
-          <w:i w:val="0"/>
-          <w:iCs w:val="0"/>
-          <w:sz w:val="22"/>
-          <w:szCs w:val="22"/>
-          <w:rtl w:val="0"/>
-        </w:rPr>
-        <w:t xml:space="preserve">Saengsuwan, C., &amp; Suwannatrai, L. (2026). Interactional metadiscourse in Thai EFL student essays: A corpus-based study. Rajapark Journal, 20(68), 138-154.</w:t>
-      </w:r>
-      <w:r>
-        <w:rPr>
-          <w:rtl w:val="0"/>
-        </w:rPr>
+        <w:jc w:val="left"/>
+        <w:rPr/>
+      </w:pPr>
+      <w:r>
+        <w:rPr>
+          <w:rFonts w:ascii="Georgia" w:hAnsi="Georgia" w:eastAsia="Georgia"/>
+          <w:sz w:val="22"/>
+        </w:rPr>
+        <w:t>Mazidah, E. N., Cahyani, W. I., &amp; Masruroh, L. (2022). Hedges and boosters in undergraduate thesis abstracts of Qomaruddin University students. Journal of Education, Humaniora and Social Sciences (JEHSS), 4(3), 1657-1663. https://doi.org/10.34007/jehss.v4i3.925</w:t>
       </w:r>
     </w:p>
     <w:p>
       <w:pPr>
         <w:spacing w:after="0" w:before="0" w:line="480" w:lineRule="auto"/>
         <w:ind w:left="720" w:hanging="720"/>
-        <w:jc w:val="both"/>
-        <w:rPr/>
-      </w:pPr>
-      <w:r>
-        <w:rPr>
-          <w:rFonts w:ascii="Georgia" w:cs="Georgia" w:eastAsia="Georgia" w:hAnsi="Georgia"/>
-          <w:b w:val="0"/>
-          <w:bCs w:val="0"/>
-          <w:i w:val="0"/>
-          <w:iCs w:val="0"/>
-          <w:sz w:val="22"/>
-          <w:szCs w:val="22"/>
-          <w:rtl w:val="0"/>
-        </w:rPr>
-        <w:t xml:space="preserve">Salager-Meyer, F. (1994). Hedges and textual communicative function in medical English written discourse. English for Specific Purposes, 13(2), 149-170. </w:t>
-      </w:r>
+        <w:jc w:val="left"/>
+        <w:rPr/>
+      </w:pPr>
       <w:hyperlink r:id="rId27">
         <w:r>
           <w:rPr>
@@ -21470,56 +21037,34 @@
       </w:hyperlink>
       <w:r>
         <w:rPr>
-          <w:rtl w:val="0"/>
-        </w:rPr>
+          <w:rFonts w:ascii="Georgia" w:hAnsi="Georgia" w:eastAsia="Georgia"/>
+          <w:sz w:val="22"/>
+        </w:rPr>
+        <w:t>Melon-Galvez, S. (2017). Intertextuality and the hedging system of the Filipino engineering students: Practices and pedagogy. International Journal of Education, 9(2), 149–156. https://doi.org/10.17509/ije.v9i2.5479</w:t>
       </w:r>
     </w:p>
     <w:p>
       <w:pPr>
         <w:spacing w:after="0" w:before="0" w:line="480" w:lineRule="auto"/>
         <w:ind w:left="720" w:hanging="720"/>
-        <w:jc w:val="both"/>
-        <w:rPr/>
-      </w:pPr>
-      <w:r>
-        <w:rPr>
-          <w:rFonts w:ascii="Georgia" w:cs="Georgia" w:eastAsia="Georgia" w:hAnsi="Georgia"/>
-          <w:b w:val="0"/>
-          <w:bCs w:val="0"/>
-          <w:i w:val="0"/>
-          <w:iCs w:val="0"/>
-          <w:sz w:val="22"/>
-          <w:szCs w:val="22"/>
-          <w:rtl w:val="0"/>
-        </w:rPr>
-        <w:t xml:space="preserve">Sepehri, M., Hajijalili, M., &amp; Namaziandost, E. (2019). Hedges and boosters in medical and engineering research articles: A comparative corpus-based study. Global Journal of Foreign Language Teaching, 9(4), 203–213. https://doi.org/10.18844/gjflt.v9i4.4342</w:t>
-      </w:r>
-      <w:r>
-        <w:rPr>
-          <w:rtl w:val="0"/>
-        </w:rPr>
+        <w:jc w:val="left"/>
+        <w:rPr/>
+      </w:pPr>
+      <w:r>
+        <w:rPr>
+          <w:rFonts w:ascii="Georgia" w:hAnsi="Georgia" w:eastAsia="Georgia"/>
+          <w:sz w:val="22"/>
+        </w:rPr>
+        <w:t>Mohammed, S. J. (2011). Lexical hedges: A study of cultural and disciplinary variation in academic research articles [Master’s thesis, Universiti Teknologi MARA]. CORE. https://core.ac.uk/download/78277430.pdf</w:t>
       </w:r>
     </w:p>
     <w:p>
       <w:pPr>
         <w:spacing w:after="0" w:before="0" w:line="480" w:lineRule="auto"/>
         <w:ind w:left="720" w:hanging="720"/>
-        <w:jc w:val="both"/>
-        <w:rPr/>
-      </w:pPr>
-      <w:r>
-        <w:rPr>
-          <w:rFonts w:ascii="Georgia" w:cs="Georgia" w:eastAsia="Georgia" w:hAnsi="Georgia"/>
-          <w:b w:val="0"/>
-          <w:bCs w:val="0"/>
-          <w:i w:val="0"/>
-          <w:iCs w:val="0"/>
-          <w:sz w:val="22"/>
-          <w:szCs w:val="22"/>
-          <w:rtl w:val="0"/>
-        </w:rPr>
-        <w:t xml:space="preserve">Souici, F., &amp; Slougui, D. (2022). Hedges in biology research articles: What types and frequency do Algerian authors use? Journal of Human Sciences, 33(4), 49-59. </w:t>
-      </w:r>
+        <w:jc w:val="left"/>
+        <w:rPr/>
+      </w:pPr>
       <w:hyperlink r:id="rId28">
         <w:r>
           <w:rPr>
@@ -21533,30 +21078,19 @@
       </w:hyperlink>
       <w:r>
         <w:rPr>
-          <w:rtl w:val="0"/>
-        </w:rPr>
+          <w:rFonts w:ascii="Georgia" w:hAnsi="Georgia" w:eastAsia="Georgia"/>
+          <w:sz w:val="22"/>
+        </w:rPr>
+        <w:t>Navrátilová, M. (2013). Hedges in biomedical research articles [Diploma thesis, Masaryk University].</w:t>
       </w:r>
     </w:p>
     <w:p>
       <w:pPr>
         <w:spacing w:after="0" w:before="0" w:line="480" w:lineRule="auto"/>
         <w:ind w:left="720" w:hanging="720"/>
-        <w:jc w:val="both"/>
-        <w:rPr/>
-      </w:pPr>
-      <w:r>
-        <w:rPr>
-          <w:rFonts w:ascii="Georgia" w:cs="Georgia" w:eastAsia="Georgia" w:hAnsi="Georgia"/>
-          <w:b w:val="0"/>
-          <w:bCs w:val="0"/>
-          <w:i w:val="0"/>
-          <w:iCs w:val="0"/>
-          <w:sz w:val="22"/>
-          <w:szCs w:val="22"/>
-          <w:rtl w:val="0"/>
-        </w:rPr>
-        <w:t xml:space="preserve">Suratno, A., &amp; Aydawati, E. N. (2025). Hedging strategies in non-science theses: A corpus-based analysis of discussion sections. ETERNAL (English Teaching Journal), 16(1), 37-52. </w:t>
-      </w:r>
+        <w:jc w:val="left"/>
+        <w:rPr/>
+      </w:pPr>
       <w:hyperlink r:id="rId29">
         <w:r>
           <w:rPr>
@@ -21570,56 +21104,34 @@
       </w:hyperlink>
       <w:r>
         <w:rPr>
-          <w:rtl w:val="0"/>
-        </w:rPr>
+          <w:rFonts w:ascii="Georgia" w:hAnsi="Georgia" w:eastAsia="Georgia"/>
+          <w:sz w:val="22"/>
+        </w:rPr>
+        <w:t>Ningrum, S., Puspita, H., &amp; Mulyadi, A. I. (2024). Hedges and boosters in academic writing of ASEAN EFL learners. Journal of English Education and Teaching, 8(1), 202-218. https://doi.org/10.33369/jeet.8.1.202-218</w:t>
       </w:r>
     </w:p>
     <w:p>
       <w:pPr>
         <w:spacing w:after="0" w:before="0" w:line="480" w:lineRule="auto"/>
         <w:ind w:left="720" w:hanging="720"/>
-        <w:jc w:val="both"/>
-        <w:rPr/>
-      </w:pPr>
-      <w:r>
-        <w:rPr>
-          <w:rFonts w:ascii="Georgia" w:cs="Georgia" w:eastAsia="Georgia" w:hAnsi="Georgia"/>
-          <w:b w:val="0"/>
-          <w:bCs w:val="0"/>
-          <w:i w:val="0"/>
-          <w:iCs w:val="0"/>
-          <w:sz w:val="22"/>
-          <w:szCs w:val="22"/>
-          <w:rtl w:val="0"/>
-        </w:rPr>
-        <w:t xml:space="preserve">Takimoto, M. (2015). Assertions and lexical invisibility in EFL learners’ academic essays. Journal of Pragmatics, 89, 85–99. https://doi.org/10.1016/j.pragma.2015.09.009</w:t>
-      </w:r>
-      <w:r>
-        <w:rPr>
-          <w:rtl w:val="0"/>
-        </w:rPr>
+        <w:jc w:val="left"/>
+        <w:rPr/>
+      </w:pPr>
+      <w:r>
+        <w:rPr>
+          <w:rFonts w:ascii="Georgia" w:hAnsi="Georgia" w:eastAsia="Georgia"/>
+          <w:sz w:val="22"/>
+        </w:rPr>
+        <w:t>Petchkij, W. (2019). Explicit teaching of hedges: Bringing hedging in academic writing into the Thai EFL classroom. Electronic Journal of Foreign Language Teaching, 16(1), 95-113. https://e-flt.nus.edu.sg/wp-content/uploads/2020/09/petchkij.pdf</w:t>
       </w:r>
     </w:p>
     <w:p>
       <w:pPr>
         <w:spacing w:after="0" w:before="0" w:line="480" w:lineRule="auto"/>
         <w:ind w:left="720" w:hanging="720"/>
-        <w:jc w:val="both"/>
-        <w:rPr/>
-      </w:pPr>
-      <w:r>
-        <w:rPr>
-          <w:rFonts w:ascii="Georgia" w:cs="Georgia" w:eastAsia="Georgia" w:hAnsi="Georgia"/>
-          <w:b w:val="0"/>
-          <w:bCs w:val="0"/>
-          <w:i w:val="0"/>
-          <w:iCs w:val="0"/>
-          <w:sz w:val="22"/>
-          <w:szCs w:val="22"/>
-          <w:rtl w:val="0"/>
-        </w:rPr>
-        <w:t xml:space="preserve">Villanueva, V. S. (2014). Hedging devices in Philippine newspaper editorials. Asian Journal of English Language Studies, 2, 103-117. </w:t>
-      </w:r>
+        <w:jc w:val="left"/>
+        <w:rPr/>
+      </w:pPr>
       <w:hyperlink r:id="rId30">
         <w:r>
           <w:rPr>
@@ -21633,76 +21145,34 @@
       </w:hyperlink>
       <w:r>
         <w:rPr>
-          <w:rtl w:val="0"/>
-        </w:rPr>
+          <w:rFonts w:ascii="Georgia" w:hAnsi="Georgia" w:eastAsia="Georgia"/>
+          <w:sz w:val="22"/>
+        </w:rPr>
+        <w:t>Qiu, X., Wang, Y. (A.), Dartey, E. A., &amp; Kim, M. (2024). Interactional metadiscourse in expert and student disciplinary writing: Exploring intrageneric and functional variation. English for Specific Purposes, 73, 124-140. https://doi.org/10.1016/j.esp.2023.10.007</w:t>
       </w:r>
     </w:p>
     <w:p>
       <w:pPr>
         <w:spacing w:after="0" w:before="0" w:line="480" w:lineRule="auto"/>
         <w:ind w:left="720" w:hanging="720"/>
-        <w:jc w:val="both"/>
-        <w:rPr/>
-      </w:pPr>
-      <w:r>
-        <w:rPr>
-          <w:rFonts w:ascii="Georgia" w:cs="Georgia" w:eastAsia="Georgia" w:hAnsi="Georgia"/>
-          <w:b w:val="0"/>
-          <w:bCs w:val="0"/>
-          <w:i w:val="0"/>
-          <w:iCs w:val="0"/>
-          <w:sz w:val="22"/>
-          <w:szCs w:val="22"/>
-          <w:rtl w:val="0"/>
-        </w:rPr>
-        <w:t xml:space="preserve">Wahyuningsih, S., &amp; Sofwan, A. (2014). Hedges in thesis abstracts of graduate students of Semarang State University. English Education Journal, 4(2), 75–81.</w:t>
-      </w:r>
-      <w:r>
-        <w:rPr>
-          <w:rtl w:val="0"/>
-        </w:rPr>
+        <w:jc w:val="left"/>
+        <w:rPr/>
+      </w:pPr>
+      <w:r>
+        <w:rPr>
+          <w:rFonts w:ascii="Georgia" w:hAnsi="Georgia" w:eastAsia="Georgia"/>
+          <w:sz w:val="22"/>
+        </w:rPr>
+        <w:t>Rezvani, R., &amp; Javadi, M. (2021). A cross-disciplinary study of hedging expressions in English articles of Iranian writers. Beyond Words, 9(1), 68–81. https://doi.org/10.33508/bw.v9i1.2517</w:t>
       </w:r>
     </w:p>
     <w:p>
       <w:pPr>
         <w:spacing w:after="0" w:before="0" w:line="480" w:lineRule="auto"/>
         <w:ind w:left="720" w:hanging="720"/>
-        <w:jc w:val="both"/>
-        <w:rPr/>
-      </w:pPr>
-      <w:r>
-        <w:rPr>
-          <w:rFonts w:ascii="Georgia" w:cs="Georgia" w:eastAsia="Georgia" w:hAnsi="Georgia"/>
-          <w:i w:val="0"/>
-          <w:iCs w:val="0"/>
-          <w:sz w:val="22"/>
-          <w:szCs w:val="22"/>
-          <w:rtl w:val="0"/>
-        </w:rPr>
-        <w:t xml:space="preserve">Wang, X. (2022). </w:t>
-      </w:r>
-      <w:r>
-        <w:rPr>
-          <w:rFonts w:ascii="Georgia" w:cs="Georgia" w:eastAsia="Georgia" w:hAnsi="Georgia"/>
-          <w:i w:val="1"/>
-          <w:iCs w:val="1"/>
-          <w:sz w:val="22"/>
-          <w:szCs w:val="22"/>
-          <w:rtl w:val="0"/>
-        </w:rPr>
-        <w:t xml:space="preserve">Hedging in academic writing: Cross-disciplinary comparisons in the Michigan Corpus of Upper-Level Student Papers (MICUSP)</w:t>
-      </w:r>
-      <w:r>
-        <w:rPr>
-          <w:rFonts w:ascii="Georgia" w:cs="Georgia" w:eastAsia="Georgia" w:hAnsi="Georgia"/>
-          <w:i w:val="0"/>
-          <w:iCs w:val="0"/>
-          <w:sz w:val="22"/>
-          <w:szCs w:val="22"/>
-          <w:rtl w:val="0"/>
-        </w:rPr>
-        <w:t xml:space="preserve"> [Preprint]. OSF Preprints. </w:t>
-      </w:r>
+        <w:jc w:val="left"/>
+        <w:rPr/>
+      </w:pPr>
       <w:hyperlink r:id="rId31">
         <w:r>
           <w:rPr>
@@ -21716,15 +21186,17 @@
       </w:hyperlink>
       <w:r>
         <w:rPr>
-          <w:rtl w:val="0"/>
-        </w:rPr>
+          <w:rFonts w:ascii="Georgia" w:hAnsi="Georgia" w:eastAsia="Georgia"/>
+          <w:sz w:val="22"/>
+        </w:rPr>
+        <w:t>Salager-Meyer, F. (1994). Hedges and textual communicative function in medical English written discourse. English for Specific Purposes, 13(2), 149-170. https://doi.org/10.1016/0889-4906(94)90013-2</w:t>
       </w:r>
     </w:p>
     <w:p>
       <w:pPr>
         <w:spacing w:after="0" w:before="0" w:line="480" w:lineRule="auto"/>
         <w:ind w:left="720" w:hanging="720"/>
-        <w:jc w:val="both"/>
+        <w:jc w:val="left"/>
         <w:rPr/>
         <w:sectPr>
           <w:headerReference w:type="default" r:id="rId48"/>
@@ -21739,111 +21211,219 @@
       </w:pPr>
       <w:r>
         <w:rPr>
-          <w:rFonts w:ascii="Georgia" w:cs="Georgia" w:eastAsia="Georgia" w:hAnsi="Georgia"/>
-          <w:b w:val="0"/>
-          <w:bCs w:val="0"/>
-          <w:i w:val="0"/>
-          <w:iCs w:val="0"/>
-          <w:sz w:val="22"/>
-          <w:szCs w:val="22"/>
-          <w:rtl w:val="0"/>
-        </w:rPr>
-        <w:t xml:space="preserve">Xie, S., &amp; Mi, C. (2023). Promotion and caution in research article abstracts: The use of positive, negative and hedge words across disciplines and rankings. Learned Publishing, 36(2), 249-265. https://doi.org/10.1002/leap.1515</w:t>
-      </w:r>
-      <w:r>
-        <w:rPr>
-          <w:rtl w:val="0"/>
-        </w:rPr>
-      </w:r>
-    </w:p>
-    <w:p>
-      <w:pPr>
-        <w:spacing w:after="0" w:before="0" w:line="480" w:lineRule="auto"/>
-        <w:rPr/>
-      </w:pPr>
-      <w:r>
-        <w:rPr>
-          <w:rtl w:val="0"/>
-        </w:rPr>
-      </w:r>
-    </w:p>
-    <w:p>
-      <w:pPr>
-        <w:spacing w:after="0" w:before="0" w:line="480" w:lineRule="auto"/>
-        <w:rPr/>
-      </w:pPr>
-      <w:r>
-        <w:rPr>
-          <w:rtl w:val="0"/>
-        </w:rPr>
-      </w:r>
-    </w:p>
-    <w:p>
-      <w:pPr>
-        <w:spacing w:after="0" w:before="0" w:line="480" w:lineRule="auto"/>
-        <w:rPr/>
-      </w:pPr>
-      <w:r>
-        <w:rPr>
-          <w:rtl w:val="0"/>
-        </w:rPr>
-      </w:r>
-    </w:p>
-    <w:p>
-      <w:pPr>
-        <w:spacing w:after="0" w:before="0" w:line="480" w:lineRule="auto"/>
-        <w:jc w:val="center"/>
-        <w:rPr/>
-      </w:pPr>
-      <w:r>
-        <w:rPr>
-          <w:rFonts w:ascii="Georgia" w:cs="Georgia" w:eastAsia="Georgia" w:hAnsi="Georgia"/>
+          <w:rFonts w:ascii="Georgia" w:hAnsi="Georgia" w:eastAsia="Georgia"/>
+          <w:sz w:val="22"/>
+        </w:rPr>
+        <w:t>Sepehri, M., Hajijalili, M., &amp; Namaziandost, E. (2019). Hedges and boosters in medical and engineering research articles: A comparative corpus-based study. Global Journal of Foreign Language Teaching, 9(4), 203–213. https://doi.org/10.18844/gjflt.v9i4.4342</w:t>
+      </w:r>
+    </w:p>
+    <w:p>
+      <w:pPr>
+        <w:spacing w:after="0" w:before="0" w:line="480" w:lineRule="auto"/>
+        <w:ind w:left="720" w:hanging="720"/>
+        <w:jc w:val="left"/>
+        <w:rPr/>
+      </w:pPr>
+      <w:r>
+        <w:rPr>
+          <w:rFonts w:ascii="Georgia" w:hAnsi="Georgia" w:eastAsia="Georgia"/>
+          <w:sz w:val="22"/>
+        </w:rPr>
+        <w:t>Smirnova, E. A., &amp; Pérez-Guerra, J. (2025). Do formal stance strategies reveal disciplinary variation in professional scientific writing? International Journal of Applied Linguistics, 35(3), 1242–1261. https://doi.org/10.1111/ijal.12694</w:t>
+      </w:r>
+    </w:p>
+    <w:p>
+      <w:pPr>
+        <w:spacing w:after="0" w:before="0" w:line="480" w:lineRule="auto"/>
+        <w:ind w:left="720" w:hanging="720"/>
+        <w:jc w:val="left"/>
+        <w:rPr/>
+      </w:pPr>
+      <w:r>
+        <w:rPr>
+          <w:rFonts w:ascii="Georgia" w:hAnsi="Georgia" w:eastAsia="Georgia"/>
+          <w:sz w:val="22"/>
+        </w:rPr>
+        <w:t>Souici, F., &amp; Slougui, D. (2022). Hedges in biology research articles: What types and frequency do Algerian authors use? Journal of Human Sciences, 33(4), 49-59. https://revue.umc.edu.dz/h/article/view/4015</w:t>
+      </w:r>
+    </w:p>
+    <w:p>
+      <w:pPr>
+        <w:spacing w:after="0" w:before="0" w:line="480" w:lineRule="auto"/>
+        <w:ind w:left="720" w:hanging="720"/>
+        <w:jc w:val="left"/>
+        <w:rPr/>
+      </w:pPr>
+      <w:r>
+        <w:rPr>
+          <w:rFonts w:ascii="Georgia" w:hAnsi="Georgia" w:eastAsia="Georgia"/>
+          <w:sz w:val="22"/>
+        </w:rPr>
+        <w:t>Suratno, A., &amp; Aydawati, E. N. (2025). Hedging strategies in non-science theses: A corpus-based analysis of discussion sections. ETERNAL (English Teaching Journal), 16(1), 37-52. https://journal2.upgris.ac.id/index.php/eternal/article/view/1059</w:t>
+      </w:r>
+    </w:p>
+    <w:p>
+      <w:pPr>
+        <w:spacing w:after="0" w:before="0" w:line="480" w:lineRule="auto"/>
+        <w:ind w:left="720" w:hanging="720"/>
+        <w:jc w:val="left"/>
+        <w:rPr/>
+      </w:pPr>
+      <w:r>
+        <w:rPr>
+          <w:rFonts w:ascii="Georgia" w:hAnsi="Georgia" w:eastAsia="Georgia"/>
+          <w:sz w:val="22"/>
+        </w:rPr>
+        <w:t>Takimoto, M. (2015). Assertions and lexical invisibility in EFL learners’ academic essays. Journal of Pragmatics, 89, 85–99. https://doi.org/10.1016/j.pragma.2015.09.009</w:t>
+      </w:r>
+    </w:p>
+    <w:p>
+      <w:pPr>
+        <w:spacing w:after="0" w:before="0" w:line="480" w:lineRule="auto"/>
+        <w:ind w:left="720" w:hanging="720"/>
+        <w:jc w:val="left"/>
+        <w:rPr/>
+      </w:pPr>
+      <w:r>
+        <w:rPr>
+          <w:rFonts w:ascii="Georgia" w:hAnsi="Georgia" w:eastAsia="Georgia"/>
+          <w:sz w:val="22"/>
+        </w:rPr>
+        <w:t>Villanueva, V. S. (2014). Hedging devices in Philippine newspaper editorials. Asian Journal of English Language Studies, 2, 103-117. https://doi.org/10.59960/2.a5</w:t>
+      </w:r>
+    </w:p>
+    <w:p>
+      <w:pPr>
+        <w:spacing w:after="0" w:before="0" w:line="480" w:lineRule="auto"/>
+        <w:ind w:left="720" w:hanging="720"/>
+        <w:jc w:val="left"/>
+        <w:rPr/>
+      </w:pPr>
+      <w:r>
+        <w:rPr>
+          <w:rFonts w:ascii="Georgia" w:hAnsi="Georgia" w:eastAsia="Georgia"/>
+          <w:sz w:val="22"/>
+        </w:rPr>
+        <w:t>Wahyuningsih, S., &amp; Sofwan, A. (2014). Hedges in thesis abstracts of graduate students of Semarang State University. English Education Journal, 4(2), 75–81.</w:t>
+      </w:r>
+    </w:p>
+    <w:p>
+      <w:pPr>
+        <w:spacing w:after="0" w:before="0" w:line="480" w:lineRule="auto"/>
+        <w:ind w:left="720" w:hanging="720"/>
+        <w:jc w:val="left"/>
+        <w:rPr/>
+      </w:pPr>
+      <w:r>
+        <w:rPr>
+          <w:rFonts w:ascii="Georgia" w:hAnsi="Georgia" w:eastAsia="Georgia"/>
+          <w:sz w:val="22"/>
+        </w:rPr>
+        <w:t>Wang, X. (2022). Hedging in academic writing: Cross-disciplinary comparisons in the Michigan Corpus of Upper-Level Student Papers (MICUSP) [Preprint]. OSF Preprints. https://osf.io/preprints/edarxiv/5xj27</w:t>
+      </w:r>
+    </w:p>
+    <w:p>
+      <w:pPr>
+        <w:spacing w:after="0" w:before="0" w:line="480" w:lineRule="auto"/>
+        <w:ind w:left="720" w:hanging="720"/>
+        <w:jc w:val="left"/>
+        <w:rPr/>
+      </w:pPr>
+      <w:r>
+        <w:rPr>
+          <w:rFonts w:ascii="Georgia" w:hAnsi="Georgia" w:eastAsia="Georgia"/>
+          <w:sz w:val="22"/>
+        </w:rPr>
+        <w:t>Xie, S., &amp; Mi, C. (2023). Promotion and caution in research article abstracts: The use of positive, negative and hedge words across disciplines and rankings. Learned Publishing, 36(2), 249-265. https://doi.org/10.1002/leap.1515</w:t>
+      </w:r>
+    </w:p>
+    <w:p>
+      <w:pPr>
+        <w:keepNext w:val="1"/>
+        <w:spacing w:after="0" w:before="0" w:line="480" w:lineRule="auto"/>
+        <w:jc w:val="left"/>
+        <w:rPr>
           <w:b w:val="1"/>
           <w:bCs w:val="1"/>
-          <w:sz w:val="28"/>
-          <w:szCs w:val="28"/>
-          <w:rtl w:val="0"/>
-        </w:rPr>
-        <w:t xml:space="preserve">APPENDIX A: HEDGING CODEBOOK</w:t>
-      </w:r>
-      <w:r>
-        <w:rPr>
-          <w:rtl w:val="0"/>
-        </w:rPr>
-      </w:r>
-    </w:p>
-    <w:p>
-      <w:pPr>
-        <w:spacing w:after="0" w:before="0" w:line="480" w:lineRule="auto"/>
-        <w:rPr/>
-      </w:pPr>
-      <w:r>
-        <w:rPr>
-          <w:rtl w:val="0"/>
-        </w:rPr>
-      </w:r>
-    </w:p>
-    <w:p>
-      <w:pPr>
-        <w:spacing w:after="0" w:before="0" w:line="480" w:lineRule="auto"/>
-        <w:rPr/>
-      </w:pPr>
-      <w:r>
-        <w:rPr>
-          <w:rtl w:val="0"/>
-        </w:rPr>
-      </w:r>
-    </w:p>
-    <w:p>
-      <w:pPr>
-        <w:spacing w:after="0" w:before="0" w:line="480" w:lineRule="auto"/>
-        <w:rPr/>
-      </w:pPr>
-      <w:r>
-        <w:rPr>
-          <w:rtl w:val="0"/>
-        </w:rPr>
-      </w:r>
+        </w:rPr>
+      </w:pPr>
+    </w:p>
+    <w:p>
+      <w:pPr>
+        <w:spacing w:after="0" w:before="0" w:line="480" w:lineRule="auto"/>
+        <w:jc w:val="both"/>
+        <w:rPr/>
+      </w:pPr>
+    </w:p>
+    <w:p>
+      <w:pPr>
+        <w:spacing w:after="0" w:before="0" w:line="480" w:lineRule="auto"/>
+        <w:rPr/>
+      </w:pPr>
+    </w:p>
+    <w:p>
+      <w:pPr>
+        <w:keepNext w:val="1"/>
+        <w:spacing w:after="0" w:before="0" w:line="480" w:lineRule="auto"/>
+        <w:jc w:val="left"/>
+        <w:rPr/>
+      </w:pPr>
+    </w:p>
+    <w:p>
+      <w:pPr>
+        <w:spacing w:after="0" w:before="0" w:line="480" w:lineRule="auto"/>
+        <w:ind w:left="720" w:hanging="360"/>
+        <w:jc w:val="both"/>
+        <w:rPr/>
+      </w:pPr>
+    </w:p>
+    <w:p>
+      <w:pPr>
+        <w:spacing w:after="0" w:before="0" w:line="480" w:lineRule="auto"/>
+        <w:ind w:left="720" w:hanging="360"/>
+        <w:jc w:val="both"/>
+        <w:rPr/>
+      </w:pPr>
+    </w:p>
+    <w:p>
+      <w:pPr>
+        <w:spacing w:after="0" w:before="0" w:line="480" w:lineRule="auto"/>
+        <w:ind w:left="720" w:hanging="360"/>
+        <w:jc w:val="both"/>
+        <w:rPr/>
+      </w:pPr>
+    </w:p>
+    <w:p>
+      <w:pPr>
+        <w:spacing w:after="0" w:before="0" w:line="480" w:lineRule="auto"/>
+        <w:ind w:left="720" w:hanging="360"/>
+        <w:jc w:val="both"/>
+        <w:rPr/>
+      </w:pPr>
+    </w:p>
+    <w:p>
+      <w:pPr>
+        <w:spacing w:after="0" w:before="0" w:line="480" w:lineRule="auto"/>
+        <w:ind w:firstLine="720"/>
+        <w:jc w:val="both"/>
+        <w:rPr/>
+      </w:pPr>
+    </w:p>
+    <w:p>
+      <w:pPr>
+        <w:spacing w:after="0" w:before="0" w:line="480" w:lineRule="auto"/>
+        <w:ind w:firstLine="720"/>
+        <w:jc w:val="both"/>
+        <w:rPr/>
+      </w:pPr>
+    </w:p>
+    <w:p>
+      <w:pPr>
+        <w:spacing w:after="0" w:before="0" w:line="480" w:lineRule="auto"/>
+        <w:ind w:firstLine="720"/>
+        <w:jc w:val="both"/>
+        <w:rPr/>
+      </w:pPr>
     </w:p>
     <w:p>
       <w:pPr>
@@ -21855,342 +21435,6 @@
           <w:bCs w:val="1"/>
         </w:rPr>
       </w:pPr>
-      <w:r>
-        <w:rPr>
-          <w:b w:val="1"/>
-          <w:bCs w:val="1"/>
-          <w:sz w:val="24"/>
-          <w:szCs w:val="24"/>
-          <w:rtl w:val="0"/>
-        </w:rPr>
-        <w:t xml:space="preserve">Quick-Reference</w:t>
-      </w:r>
-      <w:r>
-        <w:rPr>
-          <w:rtl w:val="0"/>
-        </w:rPr>
-      </w:r>
-    </w:p>
-    <w:p>
-      <w:pPr>
-        <w:spacing w:after="0" w:before="0" w:line="480" w:lineRule="auto"/>
-        <w:jc w:val="both"/>
-        <w:rPr/>
-      </w:pPr>
-      <w:r>
-        <w:rPr>
-          <w:rFonts w:ascii="Georgia" w:cs="Georgia" w:eastAsia="Georgia" w:hAnsi="Georgia"/>
-          <w:b w:val="1"/>
-          <w:bCs w:val="1"/>
-          <w:sz w:val="22"/>
-          <w:szCs w:val="22"/>
-          <w:rtl w:val="0"/>
-        </w:rPr>
-        <w:t xml:space="preserve">Context decides. </w:t>
-      </w:r>
-      <w:r>
-        <w:rPr>
-          <w:rFonts w:ascii="Georgia" w:cs="Georgia" w:eastAsia="Georgia" w:hAnsi="Georgia"/>
-          <w:sz w:val="22"/>
-          <w:szCs w:val="22"/>
-          <w:rtl w:val="0"/>
-        </w:rPr>
-        <w:t xml:space="preserve">A listed word is a hedge only when it works as one in the sentence.</w:t>
-      </w:r>
-      <w:r>
-        <w:rPr>
-          <w:rtl w:val="0"/>
-        </w:rPr>
-      </w:r>
-    </w:p>
-    <w:p>
-      <w:pPr>
-        <w:spacing w:after="0" w:before="0" w:line="480" w:lineRule="auto"/>
-        <w:rPr/>
-      </w:pPr>
-      <w:r>
-        <w:rPr>
-          <w:rtl w:val="0"/>
-        </w:rPr>
-      </w:r>
-    </w:p>
-    <w:p>
-      <w:pPr>
-        <w:keepNext w:val="1"/>
-        <w:spacing w:after="0" w:before="0" w:line="480" w:lineRule="auto"/>
-        <w:jc w:val="left"/>
-        <w:rPr/>
-      </w:pPr>
-      <w:r>
-        <w:rPr>
-          <w:rFonts w:ascii="Georgia" w:cs="Georgia" w:eastAsia="Georgia" w:hAnsi="Georgia"/>
-          <w:i w:val="1"/>
-          <w:iCs w:val="1"/>
-          <w:sz w:val="24"/>
-          <w:szCs w:val="24"/>
-          <w:rtl w:val="0"/>
-        </w:rPr>
-        <w:t xml:space="preserve">Types</w:t>
-      </w:r>
-      <w:r>
-        <w:rPr>
-          <w:rtl w:val="0"/>
-        </w:rPr>
-      </w:r>
-    </w:p>
-    <w:p>
-      <w:pPr>
-        <w:spacing w:after="0" w:before="0" w:line="480" w:lineRule="auto"/>
-        <w:ind w:left="720" w:hanging="360"/>
-        <w:jc w:val="both"/>
-        <w:rPr/>
-      </w:pPr>
-      <w:r>
-        <w:rPr>
-          <w:rFonts w:ascii="Georgia" w:cs="Georgia" w:eastAsia="Georgia" w:hAnsi="Georgia"/>
-          <w:b w:val="1"/>
-          <w:bCs w:val="1"/>
-          <w:sz w:val="22"/>
-          <w:szCs w:val="22"/>
-          <w:rtl w:val="0"/>
-        </w:rPr>
-        <w:t xml:space="preserve">• Modal: </w:t>
-      </w:r>
-      <w:r>
-        <w:rPr>
-          <w:rFonts w:ascii="Georgia" w:cs="Georgia" w:eastAsia="Georgia" w:hAnsi="Georgia"/>
-          <w:sz w:val="22"/>
-          <w:szCs w:val="22"/>
-          <w:rtl w:val="0"/>
-        </w:rPr>
-        <w:t xml:space="preserve">may, might, could, would, should, can (possibility only, not capability or obligation).</w:t>
-      </w:r>
-      <w:r>
-        <w:rPr>
-          <w:rtl w:val="0"/>
-        </w:rPr>
-      </w:r>
-    </w:p>
-    <w:p>
-      <w:pPr>
-        <w:spacing w:after="0" w:before="0" w:line="480" w:lineRule="auto"/>
-        <w:ind w:left="720" w:hanging="360"/>
-        <w:jc w:val="both"/>
-        <w:rPr/>
-      </w:pPr>
-      <w:r>
-        <w:rPr>
-          <w:rFonts w:ascii="Georgia" w:cs="Georgia" w:eastAsia="Georgia" w:hAnsi="Georgia"/>
-          <w:b w:val="1"/>
-          <w:bCs w:val="1"/>
-          <w:sz w:val="22"/>
-          <w:szCs w:val="22"/>
-          <w:rtl w:val="0"/>
-        </w:rPr>
-        <w:t xml:space="preserve">• Lexical: </w:t>
-      </w:r>
-      <w:r>
-        <w:rPr>
-          <w:rFonts w:ascii="Georgia" w:cs="Georgia" w:eastAsia="Georgia" w:hAnsi="Georgia"/>
-          <w:sz w:val="22"/>
-          <w:szCs w:val="22"/>
-          <w:rtl w:val="0"/>
-        </w:rPr>
-        <w:t xml:space="preserve">suggest, indicate, appear, seem, possible, likely, potential (when they qualify a claim and pass Step 2).</w:t>
-      </w:r>
-      <w:r>
-        <w:rPr>
-          <w:rtl w:val="0"/>
-        </w:rPr>
-      </w:r>
-    </w:p>
-    <w:p>
-      <w:pPr>
-        <w:spacing w:after="0" w:before="0" w:line="480" w:lineRule="auto"/>
-        <w:ind w:left="720" w:hanging="360"/>
-        <w:jc w:val="both"/>
-        <w:rPr/>
-      </w:pPr>
-      <w:r>
-        <w:rPr>
-          <w:rFonts w:ascii="Georgia" w:cs="Georgia" w:eastAsia="Georgia" w:hAnsi="Georgia"/>
-          <w:b w:val="1"/>
-          <w:bCs w:val="1"/>
-          <w:sz w:val="22"/>
-          <w:szCs w:val="22"/>
-          <w:rtl w:val="0"/>
-        </w:rPr>
-        <w:t xml:space="preserve">• Adverbial: </w:t>
-      </w:r>
-      <w:r>
-        <w:rPr>
-          <w:rFonts w:ascii="Georgia" w:cs="Georgia" w:eastAsia="Georgia" w:hAnsi="Georgia"/>
-          <w:sz w:val="22"/>
-          <w:szCs w:val="22"/>
-          <w:rtl w:val="0"/>
-        </w:rPr>
-        <w:t xml:space="preserve">generally, typically, possibly, probably (scope or certainty, not procedural routine).</w:t>
-      </w:r>
-      <w:r>
-        <w:rPr>
-          <w:rtl w:val="0"/>
-        </w:rPr>
-      </w:r>
-    </w:p>
-    <w:p>
-      <w:pPr>
-        <w:spacing w:after="0" w:before="0" w:line="480" w:lineRule="auto"/>
-        <w:ind w:left="720" w:hanging="360"/>
-        <w:jc w:val="both"/>
-        <w:rPr/>
-      </w:pPr>
-      <w:r>
-        <w:rPr>
-          <w:rFonts w:ascii="Georgia" w:cs="Georgia" w:eastAsia="Georgia" w:hAnsi="Georgia"/>
-          <w:b w:val="1"/>
-          <w:bCs w:val="1"/>
-          <w:sz w:val="22"/>
-          <w:szCs w:val="22"/>
-          <w:rtl w:val="0"/>
-        </w:rPr>
-        <w:t xml:space="preserve">• Clause-level: </w:t>
-      </w:r>
-      <w:r>
-        <w:rPr>
-          <w:rFonts w:ascii="Georgia" w:cs="Georgia" w:eastAsia="Georgia" w:hAnsi="Georgia"/>
-          <w:sz w:val="22"/>
-          <w:szCs w:val="22"/>
-          <w:rtl w:val="0"/>
-        </w:rPr>
-        <w:t xml:space="preserve">it seems that, it is possible that, to some extent.</w:t>
-      </w:r>
-      <w:r>
-        <w:rPr>
-          <w:rtl w:val="0"/>
-        </w:rPr>
-      </w:r>
-    </w:p>
-    <w:p>
-      <w:pPr>
-        <w:spacing w:after="0" w:before="0" w:line="480" w:lineRule="auto"/>
-        <w:ind w:firstLine="720"/>
-        <w:jc w:val="both"/>
-        <w:rPr/>
-      </w:pPr>
-      <w:r>
-        <w:rPr>
-          <w:b w:val="1"/>
-          <w:bCs w:val="1"/>
-          <w:sz w:val="22"/>
-          <w:szCs w:val="22"/>
-          <w:rtl w:val="0"/>
-        </w:rPr>
-        <w:t xml:space="preserve">Functions:</w:t>
-      </w:r>
-      <w:r>
-        <w:rPr>
-          <w:rFonts w:ascii="Georgia" w:cs="Georgia" w:eastAsia="Georgia" w:hAnsi="Georgia"/>
-          <w:sz w:val="22"/>
-          <w:szCs w:val="22"/>
-          <w:rtl w:val="0"/>
-        </w:rPr>
-        <w:t xml:space="preserve"> EC = uncertainty about a claim’s truth. P = interpersonal softening of a claim. FP = fails the claim condition or both checks.</w:t>
-      </w:r>
-      <w:r>
-        <w:rPr>
-          <w:rtl w:val="0"/>
-        </w:rPr>
-      </w:r>
-    </w:p>
-    <w:p>
-      <w:pPr>
-        <w:spacing w:after="0" w:before="0" w:line="480" w:lineRule="auto"/>
-        <w:ind w:firstLine="720"/>
-        <w:jc w:val="both"/>
-        <w:rPr/>
-      </w:pPr>
-      <w:r>
-        <w:rPr>
-          <w:b w:val="1"/>
-          <w:bCs w:val="1"/>
-          <w:sz w:val="22"/>
-          <w:szCs w:val="22"/>
-          <w:rtl w:val="0"/>
-        </w:rPr>
-        <w:t xml:space="preserve">Core rules:</w:t>
-      </w:r>
-      <w:r>
-        <w:rPr>
-          <w:rFonts w:ascii="Cardo" w:cs="Cardo" w:eastAsia="Cardo" w:hAnsi="Cardo"/>
-          <w:sz w:val="22"/>
-          <w:szCs w:val="22"/>
-          <w:rtl w:val="0"/>
-        </w:rPr>
-        <w:t xml:space="preserve"> suggest/indicate finding→hedge, recommendation→FP-Rec, can/may possibility→hedge, capability→FP-Cap, generally/typically claim-limit→hedge, procedural→FP-Proc, appear/seem result-uncertainty→hedge, location→FP-Gen.</w:t>
-      </w:r>
-      <w:r>
-        <w:rPr>
-          <w:rtl w:val="0"/>
-        </w:rPr>
-      </w:r>
-    </w:p>
-    <w:p>
-      <w:pPr>
-        <w:spacing w:after="0" w:before="0" w:line="480" w:lineRule="auto"/>
-        <w:ind w:firstLine="720"/>
-        <w:jc w:val="both"/>
-        <w:rPr/>
-      </w:pPr>
-      <w:r>
-        <w:rPr>
-          <w:b w:val="1"/>
-          <w:bCs w:val="1"/>
-          <w:sz w:val="22"/>
-          <w:szCs w:val="22"/>
-          <w:rtl w:val="0"/>
-        </w:rPr>
-        <w:t xml:space="preserve">Steps 1-3:</w:t>
-      </w:r>
-      <w:r>
-        <w:rPr>
-          <w:rFonts w:ascii="Cardo" w:cs="Cardo" w:eastAsia="Cardo" w:hAnsi="Cardo"/>
-          <w:sz w:val="22"/>
-          <w:szCs w:val="22"/>
-          <w:rtl w:val="0"/>
-        </w:rPr>
-        <w:t xml:space="preserve"> Step 1 wide-net candidates. Step 2 = claim condition, then Working Test + Reader Test → EC, P, or FP. Step 3 = type on retained P and EC.</w:t>
-      </w:r>
-      <w:r>
-        <w:rPr>
-          <w:rtl w:val="0"/>
-        </w:rPr>
-      </w:r>
-    </w:p>
-    <w:p>
-      <w:pPr>
-        <w:keepNext w:val="1"/>
-        <w:spacing w:after="0" w:before="0" w:line="480" w:lineRule="auto"/>
-        <w:jc w:val="left"/>
-        <w:rPr>
-          <w:b w:val="1"/>
-          <w:bCs w:val="1"/>
-        </w:rPr>
-      </w:pPr>
-      <w:r>
-        <w:rPr>
-          <w:b w:val="1"/>
-          <w:bCs w:val="1"/>
-          <w:sz w:val="24"/>
-          <w:szCs w:val="24"/>
-          <w:rtl w:val="0"/>
-        </w:rPr>
-        <w:t xml:space="preserve">Quick-Reference Legend</w:t>
-      </w:r>
-      <w:r>
-        <w:rPr>
-          <w:rtl w:val="0"/>
-        </w:rPr>
-      </w:r>
     </w:p>
     <w:p>
       <w:pPr>
@@ -22199,31 +21443,6 @@
         <w:jc w:val="both"/>
         <w:rPr/>
       </w:pPr>
-      <w:r>
-        <w:rPr>
-          <w:rFonts w:ascii="Georgia" w:cs="Georgia" w:eastAsia="Georgia" w:hAnsi="Georgia"/>
-          <w:b w:val="1"/>
-          <w:bCs w:val="1"/>
-          <w:sz w:val="22"/>
-          <w:szCs w:val="22"/>
-          <w:rtl w:val="0"/>
-        </w:rPr>
-        <w:t xml:space="preserve">Highlights = type background on the token. </w:t>
-      </w:r>
-      <w:r>
-        <w:rPr>
-          <w:rFonts w:ascii="Georgia" w:cs="Georgia" w:eastAsia="Georgia" w:hAnsi="Georgia"/>
-          <w:sz w:val="22"/>
-          <w:szCs w:val="22"/>
-          <w:rtl w:val="0"/>
-        </w:rPr>
-        <w:t xml:space="preserve">Colored text labels = function. Grey = unhedged verb. Strike + grey code = FP.</w:t>
-      </w:r>
-      <w:r>
-        <w:rPr>
-          <w:rtl w:val="0"/>
-        </w:rPr>
-      </w:r>
     </w:p>
     <w:tbl>
       <w:tblPr>
@@ -22742,11 +21961,6 @@
         <w:spacing w:after="0" w:before="0" w:line="480" w:lineRule="auto"/>
         <w:rPr/>
       </w:pPr>
-      <w:r>
-        <w:rPr>
-          <w:rtl w:val="0"/>
-        </w:rPr>
-      </w:r>
     </w:p>
     <w:p>
       <w:pPr>
@@ -22758,378 +21972,40 @@
           <w:bCs w:val="1"/>
         </w:rPr>
       </w:pPr>
-      <w:r>
+    </w:p>
+    <w:p>
+      <w:pPr>
+        <w:spacing w:after="0" w:before="0" w:line="480" w:lineRule="auto"/>
+        <w:ind w:firstLine="720"/>
+        <w:jc w:val="both"/>
+        <w:rPr/>
+      </w:pPr>
+    </w:p>
+    <w:p>
+      <w:pPr>
+        <w:spacing w:after="0" w:before="0" w:line="480" w:lineRule="auto"/>
+        <w:ind w:firstLine="720"/>
+        <w:jc w:val="both"/>
+        <w:rPr/>
+      </w:pPr>
+    </w:p>
+    <w:p>
+      <w:pPr>
+        <w:spacing w:after="0" w:before="0" w:line="480" w:lineRule="auto"/>
+        <w:rPr/>
+      </w:pPr>
+    </w:p>
+    <w:p>
+      <w:pPr>
+        <w:keepNext w:val="1"/>
+        <w:pageBreakBefore w:val="1"/>
+        <w:spacing w:after="0" w:before="0" w:line="480" w:lineRule="auto"/>
+        <w:jc w:val="left"/>
         <w:rPr>
           <w:b w:val="1"/>
           <w:bCs w:val="1"/>
-          <w:sz w:val="24"/>
-          <w:szCs w:val="24"/>
-          <w:rtl w:val="0"/>
-        </w:rPr>
-        <w:t xml:space="preserve">Combined Example</w:t>
-      </w:r>
-      <w:r>
-        <w:rPr>
-          <w:rtl w:val="0"/>
-        </w:rPr>
-      </w:r>
-    </w:p>
-    <w:p>
-      <w:pPr>
-        <w:spacing w:after="0" w:before="0" w:line="480" w:lineRule="auto"/>
-        <w:ind w:firstLine="720"/>
-        <w:jc w:val="both"/>
-        <w:rPr/>
-      </w:pPr>
-      <w:r>
-        <w:rPr>
-          <w:rFonts w:ascii="Georgia" w:cs="Georgia" w:eastAsia="Georgia" w:hAnsi="Georgia"/>
-          <w:sz w:val="22"/>
-          <w:szCs w:val="22"/>
-          <w:rtl w:val="0"/>
-        </w:rPr>
-        <w:t xml:space="preserve">“The results </w:t>
-      </w:r>
-      <w:r>
-        <w:rPr>
-          <w:rFonts w:ascii="Georgia" w:cs="Georgia" w:eastAsia="Georgia" w:hAnsi="Georgia"/>
-          <w:color w:val="ffffff"/>
-          <w:sz w:val="22"/>
-          <w:szCs w:val="22"/>
-          <w:highlight w:val="red"/>
-          <w:rtl w:val="0"/>
-        </w:rPr>
-        <w:t xml:space="preserve">suggested</w:t>
-      </w:r>
-      <w:r>
-        <w:rPr>
-          <w:rFonts w:ascii="Georgia" w:cs="Georgia" w:eastAsia="Georgia" w:hAnsi="Georgia"/>
-          <w:sz w:val="22"/>
-          <w:szCs w:val="22"/>
-          <w:rtl w:val="0"/>
-        </w:rPr>
-        <w:t xml:space="preserve"> (Lexical, </w:t>
-      </w:r>
-      <w:r>
-        <w:rPr>
-          <w:rFonts w:ascii="Georgia" w:cs="Georgia" w:eastAsia="Georgia" w:hAnsi="Georgia"/>
-          <w:color w:val="ed7d31"/>
-          <w:sz w:val="22"/>
-          <w:szCs w:val="22"/>
-          <w:rtl w:val="0"/>
-        </w:rPr>
-        <w:t xml:space="preserve">EC</w:t>
-      </w:r>
-      <w:r>
-        <w:rPr>
-          <w:rFonts w:ascii="Georgia" w:cs="Georgia" w:eastAsia="Georgia" w:hAnsi="Georgia"/>
-          <w:sz w:val="22"/>
-          <w:szCs w:val="22"/>
-          <w:rtl w:val="0"/>
-        </w:rPr>
-        <w:t xml:space="preserve">) that extracts are </w:t>
-      </w:r>
-      <w:r>
-        <w:rPr>
-          <w:rFonts w:ascii="Georgia" w:cs="Georgia" w:eastAsia="Georgia" w:hAnsi="Georgia"/>
-          <w:color w:val="ffffff"/>
-          <w:sz w:val="22"/>
-          <w:szCs w:val="22"/>
-          <w:highlight w:val="red"/>
-          <w:rtl w:val="0"/>
-        </w:rPr>
-        <w:t xml:space="preserve">potential</w:t>
-      </w:r>
-      <w:r>
-        <w:rPr>
-          <w:rFonts w:ascii="Georgia" w:cs="Georgia" w:eastAsia="Georgia" w:hAnsi="Georgia"/>
-          <w:sz w:val="22"/>
-          <w:szCs w:val="22"/>
-          <w:rtl w:val="0"/>
-        </w:rPr>
-        <w:t xml:space="preserve"> (Lexical, </w:t>
-      </w:r>
-      <w:r>
-        <w:rPr>
-          <w:rFonts w:ascii="Georgia" w:cs="Georgia" w:eastAsia="Georgia" w:hAnsi="Georgia"/>
-          <w:color w:val="ed7d31"/>
-          <w:sz w:val="22"/>
-          <w:szCs w:val="22"/>
-          <w:rtl w:val="0"/>
-        </w:rPr>
-        <w:t xml:space="preserve">EC</w:t>
-      </w:r>
-      <w:r>
-        <w:rPr>
-          <w:rFonts w:ascii="Georgia" w:cs="Georgia" w:eastAsia="Georgia" w:hAnsi="Georgia"/>
-          <w:sz w:val="22"/>
-          <w:szCs w:val="22"/>
-          <w:rtl w:val="0"/>
-        </w:rPr>
-        <w:t xml:space="preserve">) alternative stains. As prior studies </w:t>
-      </w:r>
-      <w:r>
-        <w:rPr>
-          <w:rFonts w:ascii="Georgia" w:cs="Georgia" w:eastAsia="Georgia" w:hAnsi="Georgia"/>
-          <w:color w:val="ffffff"/>
-          <w:sz w:val="22"/>
-          <w:szCs w:val="22"/>
-          <w:highlight w:val="red"/>
-          <w:rtl w:val="0"/>
-        </w:rPr>
-        <w:t xml:space="preserve">indicated</w:t>
-      </w:r>
-      <w:r>
-        <w:rPr>
-          <w:rFonts w:ascii="Georgia" w:cs="Georgia" w:eastAsia="Georgia" w:hAnsi="Georgia"/>
-          <w:sz w:val="22"/>
-          <w:szCs w:val="22"/>
-          <w:rtl w:val="0"/>
-        </w:rPr>
-        <w:t xml:space="preserve"> (Lexical, </w:t>
-      </w:r>
-      <w:r>
-        <w:rPr>
-          <w:rFonts w:ascii="Georgia" w:cs="Georgia" w:eastAsia="Georgia" w:hAnsi="Georgia"/>
-          <w:color w:val="7030a0"/>
-          <w:sz w:val="22"/>
-          <w:szCs w:val="22"/>
-          <w:rtl w:val="0"/>
-        </w:rPr>
-        <w:t xml:space="preserve">P</w:t>
-      </w:r>
-      <w:r>
-        <w:rPr>
-          <w:rFonts w:ascii="Georgia" w:cs="Georgia" w:eastAsia="Georgia" w:hAnsi="Georgia"/>
-          <w:sz w:val="22"/>
-          <w:szCs w:val="22"/>
-          <w:rtl w:val="0"/>
-        </w:rPr>
-        <w:t xml:space="preserve">), PCR </w:t>
-      </w:r>
-      <w:r>
-        <w:rPr>
-          <w:rFonts w:ascii="Georgia" w:cs="Georgia" w:eastAsia="Georgia" w:hAnsi="Georgia"/>
-          <w:strike w:val="1"/>
-          <w:sz w:val="22"/>
-          <w:szCs w:val="22"/>
-          <w:rtl w:val="0"/>
-        </w:rPr>
-        <w:t xml:space="preserve">can</w:t>
-      </w:r>
-      <w:r>
-        <w:rPr>
-          <w:rFonts w:ascii="Georgia" w:cs="Georgia" w:eastAsia="Georgia" w:hAnsi="Georgia"/>
-          <w:sz w:val="22"/>
-          <w:szCs w:val="22"/>
-          <w:rtl w:val="0"/>
-        </w:rPr>
-        <w:t xml:space="preserve"> </w:t>
-      </w:r>
-      <w:r>
-        <w:rPr>
-          <w:rFonts w:ascii="Georgia" w:cs="Georgia" w:eastAsia="Georgia" w:hAnsi="Georgia"/>
-          <w:color w:val="808080"/>
-          <w:sz w:val="22"/>
-          <w:szCs w:val="22"/>
-          <w:rtl w:val="0"/>
-        </w:rPr>
-        <w:t xml:space="preserve">(FP-Cap)</w:t>
-      </w:r>
-      <w:r>
-        <w:rPr>
-          <w:rFonts w:ascii="Georgia" w:cs="Georgia" w:eastAsia="Georgia" w:hAnsi="Georgia"/>
-          <w:sz w:val="22"/>
-          <w:szCs w:val="22"/>
-          <w:rtl w:val="0"/>
-        </w:rPr>
-        <w:t xml:space="preserve"> also detect low concentrations. Farmers </w:t>
-      </w:r>
-      <w:r>
-        <w:rPr>
-          <w:rFonts w:ascii="Georgia" w:cs="Georgia" w:eastAsia="Georgia" w:hAnsi="Georgia"/>
-          <w:strike w:val="1"/>
-          <w:sz w:val="22"/>
-          <w:szCs w:val="22"/>
-          <w:rtl w:val="0"/>
-        </w:rPr>
-        <w:t xml:space="preserve">should</w:t>
-      </w:r>
-      <w:r>
-        <w:rPr>
-          <w:rFonts w:ascii="Georgia" w:cs="Georgia" w:eastAsia="Georgia" w:hAnsi="Georgia"/>
-          <w:sz w:val="22"/>
-          <w:szCs w:val="22"/>
-          <w:rtl w:val="0"/>
-        </w:rPr>
-        <w:t xml:space="preserve"> </w:t>
-      </w:r>
-      <w:r>
-        <w:rPr>
-          <w:rFonts w:ascii="Georgia" w:cs="Georgia" w:eastAsia="Georgia" w:hAnsi="Georgia"/>
-          <w:color w:val="808080"/>
-          <w:sz w:val="22"/>
-          <w:szCs w:val="22"/>
-          <w:rtl w:val="0"/>
-        </w:rPr>
-        <w:t xml:space="preserve">(FP-Rec)</w:t>
-      </w:r>
-      <w:r>
-        <w:rPr>
-          <w:rFonts w:ascii="Georgia" w:cs="Georgia" w:eastAsia="Georgia" w:hAnsi="Georgia"/>
-          <w:sz w:val="22"/>
-          <w:szCs w:val="22"/>
-          <w:rtl w:val="0"/>
-        </w:rPr>
-        <w:t xml:space="preserve"> adopt the treatment. In conclusion, T3 produced the highest yield </w:t>
-      </w:r>
-      <w:r>
-        <w:rPr>
-          <w:rFonts w:ascii="Georgia" w:cs="Georgia" w:eastAsia="Georgia" w:hAnsi="Georgia"/>
-          <w:color w:val="808080"/>
-          <w:sz w:val="22"/>
-          <w:szCs w:val="22"/>
-          <w:rtl w:val="0"/>
-        </w:rPr>
-        <w:t xml:space="preserve">(FP framing)</w:t>
-      </w:r>
-      <w:r>
-        <w:rPr>
-          <w:rFonts w:ascii="Georgia" w:cs="Georgia" w:eastAsia="Georgia" w:hAnsi="Georgia"/>
-          <w:sz w:val="22"/>
-          <w:szCs w:val="22"/>
-          <w:rtl w:val="0"/>
-        </w:rPr>
-        <w:t xml:space="preserve">. The treatment </w:t>
-      </w:r>
-      <w:r>
-        <w:rPr>
-          <w:rFonts w:ascii="Georgia" w:cs="Georgia" w:eastAsia="Georgia" w:hAnsi="Georgia"/>
-          <w:sz w:val="22"/>
-          <w:szCs w:val="22"/>
-          <w:shd w:fill="00b0f0" w:val="clear"/>
-          <w:rtl w:val="0"/>
-        </w:rPr>
-        <w:t xml:space="preserve">may</w:t>
-      </w:r>
-      <w:r>
-        <w:rPr>
-          <w:rFonts w:ascii="Georgia" w:cs="Georgia" w:eastAsia="Georgia" w:hAnsi="Georgia"/>
-          <w:sz w:val="22"/>
-          <w:szCs w:val="22"/>
-          <w:rtl w:val="0"/>
-        </w:rPr>
-        <w:t xml:space="preserve"> (Modal, </w:t>
-      </w:r>
-      <w:r>
-        <w:rPr>
-          <w:rFonts w:ascii="Georgia" w:cs="Georgia" w:eastAsia="Georgia" w:hAnsi="Georgia"/>
-          <w:color w:val="ed7d31"/>
-          <w:sz w:val="22"/>
-          <w:szCs w:val="22"/>
-          <w:rtl w:val="0"/>
-        </w:rPr>
-        <w:t xml:space="preserve">EC</w:t>
-      </w:r>
-      <w:r>
-        <w:rPr>
-          <w:rFonts w:ascii="Georgia" w:cs="Georgia" w:eastAsia="Georgia" w:hAnsi="Georgia"/>
-          <w:sz w:val="22"/>
-          <w:szCs w:val="22"/>
-          <w:rtl w:val="0"/>
-        </w:rPr>
-        <w:t xml:space="preserve">) reduce infection rates.”</w:t>
-      </w:r>
-      <w:r>
-        <w:rPr>
-          <w:rtl w:val="0"/>
-        </w:rPr>
-      </w:r>
-    </w:p>
-    <w:p>
-      <w:pPr>
-        <w:spacing w:after="0" w:before="0" w:line="480" w:lineRule="auto"/>
-        <w:ind w:firstLine="720"/>
-        <w:jc w:val="both"/>
-        <w:rPr/>
-      </w:pPr>
-      <w:r>
-        <w:rPr>
-          <w:rFonts w:ascii="Georgia" w:cs="Georgia" w:eastAsia="Georgia" w:hAnsi="Georgia"/>
-          <w:b w:val="1"/>
-          <w:bCs w:val="1"/>
-          <w:color w:val="404040"/>
-          <w:sz w:val="22"/>
-          <w:szCs w:val="22"/>
-          <w:rtl w:val="0"/>
-        </w:rPr>
-        <w:t xml:space="preserve">Shows:</w:t>
-      </w:r>
-      <w:r>
-        <w:rPr>
-          <w:rFonts w:ascii="Georgia" w:cs="Georgia" w:eastAsia="Georgia" w:hAnsi="Georgia"/>
-          <w:color w:val="404040"/>
-          <w:sz w:val="22"/>
-          <w:szCs w:val="22"/>
-          <w:rtl w:val="0"/>
-        </w:rPr>
-        <w:t xml:space="preserve"> </w:t>
-      </w:r>
-      <w:r>
-        <w:rPr>
-          <w:rFonts w:ascii="Georgia" w:cs="Georgia" w:eastAsia="Georgia" w:hAnsi="Georgia"/>
-          <w:i w:val="1"/>
-          <w:iCs w:val="1"/>
-          <w:color w:val="404040"/>
-          <w:sz w:val="22"/>
-          <w:szCs w:val="22"/>
-          <w:rtl w:val="0"/>
-        </w:rPr>
-        <w:t xml:space="preserve">Lexical+Modal types. EC and P functions. FP-Cap, FP-Rec, and framing FP. Type = highlight on the token, function = colored label (EC/P). FP = strike + reason code. Not every abstract will contain P, the P slot is illustrated for coding practice.</w:t>
-      </w:r>
-      <w:r>
-        <w:rPr>
-          <w:rtl w:val="0"/>
-        </w:rPr>
-      </w:r>
-    </w:p>
-    <w:p>
-      <w:pPr>
-        <w:spacing w:after="0" w:before="0" w:line="480" w:lineRule="auto"/>
-        <w:rPr/>
-      </w:pPr>
-      <w:r>
-        <w:rPr>
-          <w:rtl w:val="0"/>
-        </w:rPr>
-      </w:r>
-    </w:p>
-    <w:p>
-      <w:pPr>
-        <w:keepNext w:val="1"/>
-        <w:pageBreakBefore w:val="1"/>
-        <w:spacing w:after="0" w:before="0" w:line="480" w:lineRule="auto"/>
-        <w:jc w:val="left"/>
-        <w:rPr>
-          <w:b w:val="1"/>
-          <w:bCs w:val="1"/>
-        </w:rPr>
-      </w:pPr>
-      <w:r>
-        <w:rPr>
-          <w:b w:val="1"/>
-          <w:bCs w:val="1"/>
-          <w:sz w:val="24"/>
-          <w:szCs w:val="24"/>
-          <w:rtl w:val="0"/>
-        </w:rPr>
-        <w:t xml:space="preserve">FULL CODEBOOK</w:t>
-      </w:r>
-      <w:r>
-        <w:rPr>
-          <w:rtl w:val="0"/>
-        </w:rPr>
-      </w:r>
+        </w:rPr>
+      </w:pPr>
     </w:p>
     <w:p>
       <w:pPr>

</xml_diff>